<commit_message>
MB001 #386: atomic correction candidate
</commit_message>
<xml_diff>
--- a/products-storage/05-ks-bez-vozvrata/03-akt-skrytyh-rabot.docx
+++ b/products-storage/05-ks-bez-vozvrata/03-akt-skrytyh-rabot.docx
@@ -42,6 +42,7 @@
       </w:tblGrid>
       <w:tr>
         <w:trPr>
+          <w:cantSplit/>
           <w:trHeight w:val="425" w:hRule="atLeast"/>
         </w:trPr>
         <w:tc>
@@ -86,6 +87,7 @@
       </w:tr>
       <w:tr>
         <w:trPr>
+          <w:cantSplit/>
           <w:trHeight w:val="425" w:hRule="atLeast"/>
         </w:trPr>
         <w:tc>
@@ -130,6 +132,7 @@
       </w:tr>
       <w:tr>
         <w:trPr>
+          <w:cantSplit/>
           <w:trHeight w:val="425" w:hRule="atLeast"/>
         </w:trPr>
         <w:tc>
@@ -174,6 +177,7 @@
       </w:tr>
       <w:tr>
         <w:trPr>
+          <w:cantSplit/>
           <w:trHeight w:val="425" w:hRule="atLeast"/>
         </w:trPr>
         <w:tc>
@@ -284,6 +288,7 @@
       </w:tblGrid>
       <w:tr>
         <w:trPr>
+          <w:cantSplit/>
           <w:trHeight w:val="425" w:hRule="atLeast"/>
         </w:trPr>
         <w:tc>
@@ -328,6 +333,7 @@
       </w:tr>
       <w:tr>
         <w:trPr>
+          <w:cantSplit/>
           <w:trHeight w:val="425" w:hRule="atLeast"/>
         </w:trPr>
         <w:tc>
@@ -372,6 +378,7 @@
       </w:tr>
       <w:tr>
         <w:trPr>
+          <w:cantSplit/>
           <w:trHeight w:val="425" w:hRule="atLeast"/>
         </w:trPr>
         <w:tc>
@@ -445,6 +452,7 @@
       </w:tblGrid>
       <w:tr>
         <w:trPr>
+          <w:cantSplit/>
           <w:tblHeader w:val="true"/>
         </w:trPr>
         <w:tc>
@@ -542,6 +550,7 @@
       </w:tr>
       <w:tr>
         <w:trPr>
+          <w:cantSplit/>
           <w:trHeight w:val="425" w:hRule="atLeast"/>
         </w:trPr>
         <w:tc>
@@ -623,6 +632,7 @@
       </w:tr>
       <w:tr>
         <w:trPr>
+          <w:cantSplit/>
           <w:trHeight w:val="425" w:hRule="atLeast"/>
         </w:trPr>
         <w:tc>
@@ -704,6 +714,7 @@
       </w:tr>
       <w:tr>
         <w:trPr>
+          <w:cantSplit/>
           <w:trHeight w:val="425" w:hRule="atLeast"/>
         </w:trPr>
         <w:tc>
@@ -785,6 +796,7 @@
       </w:tr>
       <w:tr>
         <w:trPr>
+          <w:cantSplit/>
           <w:trHeight w:val="425" w:hRule="atLeast"/>
         </w:trPr>
         <w:tc>
@@ -866,6 +878,7 @@
       </w:tr>
       <w:tr>
         <w:trPr>
+          <w:cantSplit/>
           <w:trHeight w:val="425" w:hRule="atLeast"/>
         </w:trPr>
         <w:tc>
@@ -995,6 +1008,7 @@
       </w:tblGrid>
       <w:tr>
         <w:trPr>
+          <w:cantSplit/>
           <w:trHeight w:val="425" w:hRule="atLeast"/>
         </w:trPr>
         <w:tc>
@@ -1039,6 +1053,7 @@
       </w:tr>
       <w:tr>
         <w:trPr>
+          <w:cantSplit/>
           <w:trHeight w:val="425" w:hRule="atLeast"/>
         </w:trPr>
         <w:tc>
@@ -1083,6 +1098,7 @@
       </w:tr>
       <w:tr>
         <w:trPr>
+          <w:cantSplit/>
           <w:trHeight w:val="425" w:hRule="atLeast"/>
         </w:trPr>
         <w:tc>
@@ -1127,6 +1143,7 @@
       </w:tr>
       <w:tr>
         <w:trPr>
+          <w:cantSplit/>
           <w:trHeight w:val="425" w:hRule="atLeast"/>
         </w:trPr>
         <w:tc>
@@ -1171,6 +1188,7 @@
       </w:tr>
       <w:tr>
         <w:trPr>
+          <w:cantSplit/>
           <w:trHeight w:val="425" w:hRule="atLeast"/>
         </w:trPr>
         <w:tc>
@@ -1215,6 +1233,7 @@
       </w:tr>
       <w:tr>
         <w:trPr>
+          <w:cantSplit/>
           <w:trHeight w:val="425" w:hRule="atLeast"/>
         </w:trPr>
         <w:tc>
@@ -1292,6 +1311,7 @@
       </w:tblGrid>
       <w:tr>
         <w:trPr>
+          <w:cantSplit/>
           <w:tblHeader w:val="true"/>
         </w:trPr>
         <w:tc>
@@ -1365,6 +1385,7 @@
       </w:tr>
       <w:tr>
         <w:trPr>
+          <w:cantSplit/>
           <w:trHeight w:val="425" w:hRule="atLeast"/>
         </w:trPr>
         <w:tc>
@@ -1430,6 +1451,7 @@
       </w:tr>
       <w:tr>
         <w:trPr>
+          <w:cantSplit/>
           <w:trHeight w:val="425" w:hRule="atLeast"/>
         </w:trPr>
         <w:tc>
@@ -1495,6 +1517,7 @@
       </w:tr>
       <w:tr>
         <w:trPr>
+          <w:cantSplit/>
           <w:trHeight w:val="425" w:hRule="atLeast"/>
         </w:trPr>
         <w:tc>
@@ -1617,6 +1640,7 @@
       </w:tblGrid>
       <w:tr>
         <w:trPr>
+          <w:cantSplit/>
           <w:tblHeader w:val="true"/>
         </w:trPr>
         <w:tc>
@@ -1690,6 +1714,7 @@
       </w:tr>
       <w:tr>
         <w:trPr>
+          <w:cantSplit/>
           <w:trHeight w:val="425" w:hRule="atLeast"/>
         </w:trPr>
         <w:tc>
@@ -1756,6 +1781,7 @@
       </w:tr>
       <w:tr>
         <w:trPr>
+          <w:cantSplit/>
           <w:trHeight w:val="425" w:hRule="atLeast"/>
         </w:trPr>
         <w:tc>
@@ -1822,6 +1848,7 @@
       </w:tr>
       <w:tr>
         <w:trPr>
+          <w:cantSplit/>
           <w:trHeight w:val="425" w:hRule="atLeast"/>
         </w:trPr>
         <w:tc>
@@ -1888,6 +1915,7 @@
       </w:tr>
       <w:tr>
         <w:trPr>
+          <w:cantSplit/>
           <w:trHeight w:val="425" w:hRule="atLeast"/>
         </w:trPr>
         <w:tc>
@@ -1971,6 +1999,7 @@
       </w:tblGrid>
       <w:tr>
         <w:trPr>
+          <w:cantSplit/>
           <w:trHeight w:val="425" w:hRule="atLeast"/>
         </w:trPr>
         <w:tc>
@@ -2109,6 +2138,7 @@
       </w:tblGrid>
       <w:tr>
         <w:trPr>
+          <w:cantSplit/>
           <w:tblHeader w:val="true"/>
         </w:trPr>
         <w:tc>
@@ -2165,6 +2195,7 @@
       </w:tr>
       <w:tr>
         <w:trPr>
+          <w:cantSplit/>
           <w:trHeight w:val="425" w:hRule="atLeast"/>
         </w:trPr>
         <w:tc>
@@ -2217,6 +2248,7 @@
       </w:tr>
       <w:tr>
         <w:trPr>
+          <w:cantSplit/>
           <w:trHeight w:val="425" w:hRule="atLeast"/>
         </w:trPr>
         <w:tc>
@@ -2269,6 +2301,7 @@
       </w:tr>
       <w:tr>
         <w:trPr>
+          <w:cantSplit/>
           <w:trHeight w:val="425" w:hRule="atLeast"/>
         </w:trPr>
         <w:tc>
@@ -2321,6 +2354,7 @@
       </w:tr>
       <w:tr>
         <w:trPr>
+          <w:cantSplit/>
           <w:trHeight w:val="425" w:hRule="atLeast"/>
         </w:trPr>
         <w:tc>
@@ -2373,6 +2407,7 @@
       </w:tr>
       <w:tr>
         <w:trPr>
+          <w:cantSplit/>
           <w:trHeight w:val="425" w:hRule="atLeast"/>
         </w:trPr>
         <w:tc>
@@ -2453,6 +2488,7 @@
       </w:tblGrid>
       <w:tr>
         <w:trPr>
+          <w:cantSplit/>
           <w:tblHeader w:val="true"/>
         </w:trPr>
         <w:tc>
@@ -2526,6 +2562,7 @@
       </w:tr>
       <w:tr>
         <w:trPr>
+          <w:cantSplit/>
           <w:trHeight w:val="567" w:hRule="atLeast"/>
         </w:trPr>
         <w:tc>
@@ -2592,6 +2629,7 @@
       </w:tr>
       <w:tr>
         <w:trPr>
+          <w:cantSplit/>
           <w:trHeight w:val="567" w:hRule="atLeast"/>
         </w:trPr>
         <w:tc>
@@ -2658,6 +2696,7 @@
       </w:tr>
       <w:tr>
         <w:trPr>
+          <w:cantSplit/>
           <w:trHeight w:val="567" w:hRule="atLeast"/>
         </w:trPr>
         <w:tc>
@@ -2724,6 +2763,7 @@
       </w:tr>
       <w:tr>
         <w:trPr>
+          <w:cantSplit/>
           <w:trHeight w:val="567" w:hRule="atLeast"/>
         </w:trPr>
         <w:tc>
@@ -2790,6 +2830,7 @@
       </w:tr>
       <w:tr>
         <w:trPr>
+          <w:cantSplit/>
           <w:trHeight w:val="567" w:hRule="atLeast"/>
         </w:trPr>
         <w:tc>
@@ -2916,6 +2957,7 @@
       </w:tblGrid>
       <w:tr>
         <w:trPr>
+          <w:cantSplit/>
           <w:trHeight w:val="425" w:hRule="atLeast"/>
         </w:trPr>
         <w:tc>
@@ -2960,6 +3002,7 @@
       </w:tr>
       <w:tr>
         <w:trPr>
+          <w:cantSplit/>
           <w:trHeight w:val="425" w:hRule="atLeast"/>
         </w:trPr>
         <w:tc>
@@ -3004,6 +3047,7 @@
       </w:tr>
       <w:tr>
         <w:trPr>
+          <w:cantSplit/>
           <w:trHeight w:val="425" w:hRule="atLeast"/>
         </w:trPr>
         <w:tc>
@@ -3048,6 +3092,7 @@
       </w:tr>
       <w:tr>
         <w:trPr>
+          <w:cantSplit/>
           <w:trHeight w:val="425" w:hRule="atLeast"/>
         </w:trPr>
         <w:tc>
@@ -3158,6 +3203,7 @@
       </w:tblGrid>
       <w:tr>
         <w:trPr>
+          <w:cantSplit/>
           <w:trHeight w:val="425" w:hRule="atLeast"/>
         </w:trPr>
         <w:tc>
@@ -3202,6 +3248,7 @@
       </w:tr>
       <w:tr>
         <w:trPr>
+          <w:cantSplit/>
           <w:trHeight w:val="425" w:hRule="atLeast"/>
         </w:trPr>
         <w:tc>
@@ -3246,6 +3293,7 @@
       </w:tr>
       <w:tr>
         <w:trPr>
+          <w:cantSplit/>
           <w:trHeight w:val="425" w:hRule="atLeast"/>
         </w:trPr>
         <w:tc>
@@ -3319,6 +3367,7 @@
       </w:tblGrid>
       <w:tr>
         <w:trPr>
+          <w:cantSplit/>
           <w:tblHeader w:val="true"/>
         </w:trPr>
         <w:tc>
@@ -3416,6 +3465,7 @@
       </w:tr>
       <w:tr>
         <w:trPr>
+          <w:cantSplit/>
           <w:trHeight w:val="425" w:hRule="atLeast"/>
         </w:trPr>
         <w:tc>
@@ -3497,6 +3547,7 @@
       </w:tr>
       <w:tr>
         <w:trPr>
+          <w:cantSplit/>
           <w:trHeight w:val="425" w:hRule="atLeast"/>
         </w:trPr>
         <w:tc>
@@ -3578,6 +3629,7 @@
       </w:tr>
       <w:tr>
         <w:trPr>
+          <w:cantSplit/>
           <w:trHeight w:val="425" w:hRule="atLeast"/>
         </w:trPr>
         <w:tc>
@@ -3659,6 +3711,7 @@
       </w:tr>
       <w:tr>
         <w:trPr>
+          <w:cantSplit/>
           <w:trHeight w:val="425" w:hRule="atLeast"/>
         </w:trPr>
         <w:tc>
@@ -3740,6 +3793,7 @@
       </w:tr>
       <w:tr>
         <w:trPr>
+          <w:cantSplit/>
           <w:trHeight w:val="425" w:hRule="atLeast"/>
         </w:trPr>
         <w:tc>
@@ -3869,6 +3923,7 @@
       </w:tblGrid>
       <w:tr>
         <w:trPr>
+          <w:cantSplit/>
           <w:trHeight w:val="425" w:hRule="atLeast"/>
         </w:trPr>
         <w:tc>
@@ -3913,6 +3968,7 @@
       </w:tr>
       <w:tr>
         <w:trPr>
+          <w:cantSplit/>
           <w:trHeight w:val="425" w:hRule="atLeast"/>
         </w:trPr>
         <w:tc>
@@ -3957,6 +4013,7 @@
       </w:tr>
       <w:tr>
         <w:trPr>
+          <w:cantSplit/>
           <w:trHeight w:val="425" w:hRule="atLeast"/>
         </w:trPr>
         <w:tc>
@@ -4001,6 +4058,7 @@
       </w:tr>
       <w:tr>
         <w:trPr>
+          <w:cantSplit/>
           <w:trHeight w:val="425" w:hRule="atLeast"/>
         </w:trPr>
         <w:tc>
@@ -4045,6 +4103,7 @@
       </w:tr>
       <w:tr>
         <w:trPr>
+          <w:cantSplit/>
           <w:trHeight w:val="425" w:hRule="atLeast"/>
         </w:trPr>
         <w:tc>
@@ -4089,6 +4148,7 @@
       </w:tr>
       <w:tr>
         <w:trPr>
+          <w:cantSplit/>
           <w:trHeight w:val="425" w:hRule="atLeast"/>
         </w:trPr>
         <w:tc>
@@ -4166,6 +4226,7 @@
       </w:tblGrid>
       <w:tr>
         <w:trPr>
+          <w:cantSplit/>
           <w:tblHeader w:val="true"/>
         </w:trPr>
         <w:tc>
@@ -4239,6 +4300,7 @@
       </w:tr>
       <w:tr>
         <w:trPr>
+          <w:cantSplit/>
           <w:trHeight w:val="425" w:hRule="atLeast"/>
         </w:trPr>
         <w:tc>
@@ -4304,6 +4366,7 @@
       </w:tr>
       <w:tr>
         <w:trPr>
+          <w:cantSplit/>
           <w:trHeight w:val="425" w:hRule="atLeast"/>
         </w:trPr>
         <w:tc>
@@ -4369,6 +4432,7 @@
       </w:tr>
       <w:tr>
         <w:trPr>
+          <w:cantSplit/>
           <w:trHeight w:val="425" w:hRule="atLeast"/>
         </w:trPr>
         <w:tc>
@@ -4491,6 +4555,7 @@
       </w:tblGrid>
       <w:tr>
         <w:trPr>
+          <w:cantSplit/>
           <w:tblHeader w:val="true"/>
         </w:trPr>
         <w:tc>
@@ -4564,6 +4629,7 @@
       </w:tr>
       <w:tr>
         <w:trPr>
+          <w:cantSplit/>
           <w:trHeight w:val="425" w:hRule="atLeast"/>
         </w:trPr>
         <w:tc>
@@ -4630,6 +4696,7 @@
       </w:tr>
       <w:tr>
         <w:trPr>
+          <w:cantSplit/>
           <w:trHeight w:val="425" w:hRule="atLeast"/>
         </w:trPr>
         <w:tc>
@@ -4696,6 +4763,7 @@
       </w:tr>
       <w:tr>
         <w:trPr>
+          <w:cantSplit/>
           <w:trHeight w:val="425" w:hRule="atLeast"/>
         </w:trPr>
         <w:tc>
@@ -4762,6 +4830,7 @@
       </w:tr>
       <w:tr>
         <w:trPr>
+          <w:cantSplit/>
           <w:trHeight w:val="425" w:hRule="atLeast"/>
         </w:trPr>
         <w:tc>
@@ -4828,6 +4897,7 @@
       </w:tr>
       <w:tr>
         <w:trPr>
+          <w:cantSplit/>
           <w:trHeight w:val="425" w:hRule="atLeast"/>
         </w:trPr>
         <w:tc>
@@ -4911,6 +4981,7 @@
       </w:tblGrid>
       <w:tr>
         <w:trPr>
+          <w:cantSplit/>
           <w:trHeight w:val="425" w:hRule="atLeast"/>
         </w:trPr>
         <w:tc>
@@ -5049,6 +5120,7 @@
       </w:tblGrid>
       <w:tr>
         <w:trPr>
+          <w:cantSplit/>
           <w:tblHeader w:val="true"/>
         </w:trPr>
         <w:tc>
@@ -5105,6 +5177,7 @@
       </w:tr>
       <w:tr>
         <w:trPr>
+          <w:cantSplit/>
           <w:trHeight w:val="425" w:hRule="atLeast"/>
         </w:trPr>
         <w:tc>
@@ -5157,6 +5230,7 @@
       </w:tr>
       <w:tr>
         <w:trPr>
+          <w:cantSplit/>
           <w:trHeight w:val="425" w:hRule="atLeast"/>
         </w:trPr>
         <w:tc>
@@ -5209,6 +5283,7 @@
       </w:tr>
       <w:tr>
         <w:trPr>
+          <w:cantSplit/>
           <w:trHeight w:val="425" w:hRule="atLeast"/>
         </w:trPr>
         <w:tc>
@@ -5261,6 +5336,7 @@
       </w:tr>
       <w:tr>
         <w:trPr>
+          <w:cantSplit/>
           <w:trHeight w:val="425" w:hRule="atLeast"/>
         </w:trPr>
         <w:tc>
@@ -5313,6 +5389,7 @@
       </w:tr>
       <w:tr>
         <w:trPr>
+          <w:cantSplit/>
           <w:trHeight w:val="425" w:hRule="atLeast"/>
         </w:trPr>
         <w:tc>
@@ -5393,6 +5470,7 @@
       </w:tblGrid>
       <w:tr>
         <w:trPr>
+          <w:cantSplit/>
           <w:tblHeader w:val="true"/>
         </w:trPr>
         <w:tc>
@@ -5466,6 +5544,7 @@
       </w:tr>
       <w:tr>
         <w:trPr>
+          <w:cantSplit/>
           <w:trHeight w:val="567" w:hRule="atLeast"/>
         </w:trPr>
         <w:tc>
@@ -5532,6 +5611,7 @@
       </w:tr>
       <w:tr>
         <w:trPr>
+          <w:cantSplit/>
           <w:trHeight w:val="567" w:hRule="atLeast"/>
         </w:trPr>
         <w:tc>
@@ -5598,6 +5678,7 @@
       </w:tr>
       <w:tr>
         <w:trPr>
+          <w:cantSplit/>
           <w:trHeight w:val="567" w:hRule="atLeast"/>
         </w:trPr>
         <w:tc>
@@ -5664,6 +5745,7 @@
       </w:tr>
       <w:tr>
         <w:trPr>
+          <w:cantSplit/>
           <w:trHeight w:val="567" w:hRule="atLeast"/>
         </w:trPr>
         <w:tc>
@@ -5730,6 +5812,7 @@
       </w:tr>
       <w:tr>
         <w:trPr>
+          <w:cantSplit/>
           <w:trHeight w:val="567" w:hRule="atLeast"/>
         </w:trPr>
         <w:tc>
@@ -5856,6 +5939,7 @@
       </w:tblGrid>
       <w:tr>
         <w:trPr>
+          <w:cantSplit/>
           <w:trHeight w:val="425" w:hRule="atLeast"/>
         </w:trPr>
         <w:tc>
@@ -5900,6 +5984,7 @@
       </w:tr>
       <w:tr>
         <w:trPr>
+          <w:cantSplit/>
           <w:trHeight w:val="425" w:hRule="atLeast"/>
         </w:trPr>
         <w:tc>
@@ -5944,6 +6029,7 @@
       </w:tr>
       <w:tr>
         <w:trPr>
+          <w:cantSplit/>
           <w:trHeight w:val="425" w:hRule="atLeast"/>
         </w:trPr>
         <w:tc>
@@ -5988,6 +6074,7 @@
       </w:tr>
       <w:tr>
         <w:trPr>
+          <w:cantSplit/>
           <w:trHeight w:val="425" w:hRule="atLeast"/>
         </w:trPr>
         <w:tc>
@@ -6098,6 +6185,7 @@
       </w:tblGrid>
       <w:tr>
         <w:trPr>
+          <w:cantSplit/>
           <w:trHeight w:val="425" w:hRule="atLeast"/>
         </w:trPr>
         <w:tc>
@@ -6142,6 +6230,7 @@
       </w:tr>
       <w:tr>
         <w:trPr>
+          <w:cantSplit/>
           <w:trHeight w:val="425" w:hRule="atLeast"/>
         </w:trPr>
         <w:tc>
@@ -6186,6 +6275,7 @@
       </w:tr>
       <w:tr>
         <w:trPr>
+          <w:cantSplit/>
           <w:trHeight w:val="425" w:hRule="atLeast"/>
         </w:trPr>
         <w:tc>
@@ -6259,6 +6349,7 @@
       </w:tblGrid>
       <w:tr>
         <w:trPr>
+          <w:cantSplit/>
           <w:tblHeader w:val="true"/>
         </w:trPr>
         <w:tc>
@@ -6356,6 +6447,7 @@
       </w:tr>
       <w:tr>
         <w:trPr>
+          <w:cantSplit/>
           <w:trHeight w:val="425" w:hRule="atLeast"/>
         </w:trPr>
         <w:tc>
@@ -6437,6 +6529,7 @@
       </w:tr>
       <w:tr>
         <w:trPr>
+          <w:cantSplit/>
           <w:trHeight w:val="425" w:hRule="atLeast"/>
         </w:trPr>
         <w:tc>
@@ -6518,6 +6611,7 @@
       </w:tr>
       <w:tr>
         <w:trPr>
+          <w:cantSplit/>
           <w:trHeight w:val="425" w:hRule="atLeast"/>
         </w:trPr>
         <w:tc>
@@ -6599,6 +6693,7 @@
       </w:tr>
       <w:tr>
         <w:trPr>
+          <w:cantSplit/>
           <w:trHeight w:val="425" w:hRule="atLeast"/>
         </w:trPr>
         <w:tc>
@@ -6680,6 +6775,7 @@
       </w:tr>
       <w:tr>
         <w:trPr>
+          <w:cantSplit/>
           <w:trHeight w:val="425" w:hRule="atLeast"/>
         </w:trPr>
         <w:tc>
@@ -6809,6 +6905,7 @@
       </w:tblGrid>
       <w:tr>
         <w:trPr>
+          <w:cantSplit/>
           <w:trHeight w:val="425" w:hRule="atLeast"/>
         </w:trPr>
         <w:tc>
@@ -6853,6 +6950,7 @@
       </w:tr>
       <w:tr>
         <w:trPr>
+          <w:cantSplit/>
           <w:trHeight w:val="425" w:hRule="atLeast"/>
         </w:trPr>
         <w:tc>
@@ -6897,6 +6995,7 @@
       </w:tr>
       <w:tr>
         <w:trPr>
+          <w:cantSplit/>
           <w:trHeight w:val="425" w:hRule="atLeast"/>
         </w:trPr>
         <w:tc>
@@ -6941,6 +7040,7 @@
       </w:tr>
       <w:tr>
         <w:trPr>
+          <w:cantSplit/>
           <w:trHeight w:val="425" w:hRule="atLeast"/>
         </w:trPr>
         <w:tc>
@@ -6985,6 +7085,7 @@
       </w:tr>
       <w:tr>
         <w:trPr>
+          <w:cantSplit/>
           <w:trHeight w:val="425" w:hRule="atLeast"/>
         </w:trPr>
         <w:tc>
@@ -7029,6 +7130,7 @@
       </w:tr>
       <w:tr>
         <w:trPr>
+          <w:cantSplit/>
           <w:trHeight w:val="425" w:hRule="atLeast"/>
         </w:trPr>
         <w:tc>
@@ -7106,6 +7208,7 @@
       </w:tblGrid>
       <w:tr>
         <w:trPr>
+          <w:cantSplit/>
           <w:tblHeader w:val="true"/>
         </w:trPr>
         <w:tc>
@@ -7179,6 +7282,7 @@
       </w:tr>
       <w:tr>
         <w:trPr>
+          <w:cantSplit/>
           <w:trHeight w:val="425" w:hRule="atLeast"/>
         </w:trPr>
         <w:tc>
@@ -7244,6 +7348,7 @@
       </w:tr>
       <w:tr>
         <w:trPr>
+          <w:cantSplit/>
           <w:trHeight w:val="425" w:hRule="atLeast"/>
         </w:trPr>
         <w:tc>
@@ -7309,6 +7414,7 @@
       </w:tr>
       <w:tr>
         <w:trPr>
+          <w:cantSplit/>
           <w:trHeight w:val="425" w:hRule="atLeast"/>
         </w:trPr>
         <w:tc>
@@ -7431,6 +7537,7 @@
       </w:tblGrid>
       <w:tr>
         <w:trPr>
+          <w:cantSplit/>
           <w:tblHeader w:val="true"/>
         </w:trPr>
         <w:tc>
@@ -7504,6 +7611,7 @@
       </w:tr>
       <w:tr>
         <w:trPr>
+          <w:cantSplit/>
           <w:trHeight w:val="425" w:hRule="atLeast"/>
         </w:trPr>
         <w:tc>
@@ -7570,6 +7678,7 @@
       </w:tr>
       <w:tr>
         <w:trPr>
+          <w:cantSplit/>
           <w:trHeight w:val="425" w:hRule="atLeast"/>
         </w:trPr>
         <w:tc>
@@ -7636,6 +7745,7 @@
       </w:tr>
       <w:tr>
         <w:trPr>
+          <w:cantSplit/>
           <w:trHeight w:val="425" w:hRule="atLeast"/>
         </w:trPr>
         <w:tc>
@@ -7702,6 +7812,7 @@
       </w:tr>
       <w:tr>
         <w:trPr>
+          <w:cantSplit/>
           <w:trHeight w:val="425" w:hRule="atLeast"/>
         </w:trPr>
         <w:tc>
@@ -7768,6 +7879,7 @@
       </w:tr>
       <w:tr>
         <w:trPr>
+          <w:cantSplit/>
           <w:trHeight w:val="425" w:hRule="atLeast"/>
         </w:trPr>
         <w:tc>
@@ -7834,6 +7946,7 @@
       </w:tr>
       <w:tr>
         <w:trPr>
+          <w:cantSplit/>
           <w:trHeight w:val="425" w:hRule="atLeast"/>
         </w:trPr>
         <w:tc>
@@ -7917,6 +8030,7 @@
       </w:tblGrid>
       <w:tr>
         <w:trPr>
+          <w:cantSplit/>
           <w:trHeight w:val="425" w:hRule="atLeast"/>
         </w:trPr>
         <w:tc>
@@ -8055,6 +8169,7 @@
       </w:tblGrid>
       <w:tr>
         <w:trPr>
+          <w:cantSplit/>
           <w:tblHeader w:val="true"/>
         </w:trPr>
         <w:tc>
@@ -8111,6 +8226,7 @@
       </w:tr>
       <w:tr>
         <w:trPr>
+          <w:cantSplit/>
           <w:trHeight w:val="425" w:hRule="atLeast"/>
         </w:trPr>
         <w:tc>
@@ -8163,6 +8279,7 @@
       </w:tr>
       <w:tr>
         <w:trPr>
+          <w:cantSplit/>
           <w:trHeight w:val="425" w:hRule="atLeast"/>
         </w:trPr>
         <w:tc>
@@ -8215,6 +8332,7 @@
       </w:tr>
       <w:tr>
         <w:trPr>
+          <w:cantSplit/>
           <w:trHeight w:val="425" w:hRule="atLeast"/>
         </w:trPr>
         <w:tc>
@@ -8267,6 +8385,7 @@
       </w:tr>
       <w:tr>
         <w:trPr>
+          <w:cantSplit/>
           <w:trHeight w:val="425" w:hRule="atLeast"/>
         </w:trPr>
         <w:tc>
@@ -8319,6 +8438,7 @@
       </w:tr>
       <w:tr>
         <w:trPr>
+          <w:cantSplit/>
           <w:trHeight w:val="425" w:hRule="atLeast"/>
         </w:trPr>
         <w:tc>
@@ -8399,6 +8519,7 @@
       </w:tblGrid>
       <w:tr>
         <w:trPr>
+          <w:cantSplit/>
           <w:tblHeader w:val="true"/>
         </w:trPr>
         <w:tc>
@@ -8472,6 +8593,7 @@
       </w:tr>
       <w:tr>
         <w:trPr>
+          <w:cantSplit/>
           <w:trHeight w:val="567" w:hRule="atLeast"/>
         </w:trPr>
         <w:tc>
@@ -8538,6 +8660,7 @@
       </w:tr>
       <w:tr>
         <w:trPr>
+          <w:cantSplit/>
           <w:trHeight w:val="567" w:hRule="atLeast"/>
         </w:trPr>
         <w:tc>
@@ -8604,6 +8727,7 @@
       </w:tr>
       <w:tr>
         <w:trPr>
+          <w:cantSplit/>
           <w:trHeight w:val="567" w:hRule="atLeast"/>
         </w:trPr>
         <w:tc>
@@ -8670,6 +8794,7 @@
       </w:tr>
       <w:tr>
         <w:trPr>
+          <w:cantSplit/>
           <w:trHeight w:val="567" w:hRule="atLeast"/>
         </w:trPr>
         <w:tc>
@@ -8736,6 +8861,7 @@
       </w:tr>
       <w:tr>
         <w:trPr>
+          <w:cantSplit/>
           <w:trHeight w:val="567" w:hRule="atLeast"/>
         </w:trPr>
         <w:tc>
@@ -8862,6 +8988,7 @@
       </w:tblGrid>
       <w:tr>
         <w:trPr>
+          <w:cantSplit/>
           <w:trHeight w:val="425" w:hRule="atLeast"/>
         </w:trPr>
         <w:tc>
@@ -8906,6 +9033,7 @@
       </w:tr>
       <w:tr>
         <w:trPr>
+          <w:cantSplit/>
           <w:trHeight w:val="425" w:hRule="atLeast"/>
         </w:trPr>
         <w:tc>
@@ -8950,6 +9078,7 @@
       </w:tr>
       <w:tr>
         <w:trPr>
+          <w:cantSplit/>
           <w:trHeight w:val="425" w:hRule="atLeast"/>
         </w:trPr>
         <w:tc>
@@ -8994,6 +9123,7 @@
       </w:tr>
       <w:tr>
         <w:trPr>
+          <w:cantSplit/>
           <w:trHeight w:val="425" w:hRule="atLeast"/>
         </w:trPr>
         <w:tc>
@@ -9104,6 +9234,7 @@
       </w:tblGrid>
       <w:tr>
         <w:trPr>
+          <w:cantSplit/>
           <w:trHeight w:val="425" w:hRule="atLeast"/>
         </w:trPr>
         <w:tc>
@@ -9148,6 +9279,7 @@
       </w:tr>
       <w:tr>
         <w:trPr>
+          <w:cantSplit/>
           <w:trHeight w:val="425" w:hRule="atLeast"/>
         </w:trPr>
         <w:tc>
@@ -9192,6 +9324,7 @@
       </w:tr>
       <w:tr>
         <w:trPr>
+          <w:cantSplit/>
           <w:trHeight w:val="425" w:hRule="atLeast"/>
         </w:trPr>
         <w:tc>
@@ -9265,6 +9398,7 @@
       </w:tblGrid>
       <w:tr>
         <w:trPr>
+          <w:cantSplit/>
           <w:tblHeader w:val="true"/>
         </w:trPr>
         <w:tc>
@@ -9362,6 +9496,7 @@
       </w:tr>
       <w:tr>
         <w:trPr>
+          <w:cantSplit/>
           <w:trHeight w:val="425" w:hRule="atLeast"/>
         </w:trPr>
         <w:tc>
@@ -9443,6 +9578,7 @@
       </w:tr>
       <w:tr>
         <w:trPr>
+          <w:cantSplit/>
           <w:trHeight w:val="425" w:hRule="atLeast"/>
         </w:trPr>
         <w:tc>
@@ -9524,6 +9660,7 @@
       </w:tr>
       <w:tr>
         <w:trPr>
+          <w:cantSplit/>
           <w:trHeight w:val="425" w:hRule="atLeast"/>
         </w:trPr>
         <w:tc>
@@ -9605,6 +9742,7 @@
       </w:tr>
       <w:tr>
         <w:trPr>
+          <w:cantSplit/>
           <w:trHeight w:val="425" w:hRule="atLeast"/>
         </w:trPr>
         <w:tc>
@@ -9686,6 +9824,7 @@
       </w:tr>
       <w:tr>
         <w:trPr>
+          <w:cantSplit/>
           <w:trHeight w:val="425" w:hRule="atLeast"/>
         </w:trPr>
         <w:tc>
@@ -9815,6 +9954,7 @@
       </w:tblGrid>
       <w:tr>
         <w:trPr>
+          <w:cantSplit/>
           <w:trHeight w:val="425" w:hRule="atLeast"/>
         </w:trPr>
         <w:tc>
@@ -9859,6 +9999,7 @@
       </w:tr>
       <w:tr>
         <w:trPr>
+          <w:cantSplit/>
           <w:trHeight w:val="425" w:hRule="atLeast"/>
         </w:trPr>
         <w:tc>
@@ -9903,6 +10044,7 @@
       </w:tr>
       <w:tr>
         <w:trPr>
+          <w:cantSplit/>
           <w:trHeight w:val="425" w:hRule="atLeast"/>
         </w:trPr>
         <w:tc>
@@ -9947,6 +10089,7 @@
       </w:tr>
       <w:tr>
         <w:trPr>
+          <w:cantSplit/>
           <w:trHeight w:val="425" w:hRule="atLeast"/>
         </w:trPr>
         <w:tc>
@@ -9991,6 +10134,7 @@
       </w:tr>
       <w:tr>
         <w:trPr>
+          <w:cantSplit/>
           <w:trHeight w:val="425" w:hRule="atLeast"/>
         </w:trPr>
         <w:tc>
@@ -10035,6 +10179,7 @@
       </w:tr>
       <w:tr>
         <w:trPr>
+          <w:cantSplit/>
           <w:trHeight w:val="425" w:hRule="atLeast"/>
         </w:trPr>
         <w:tc>
@@ -10112,6 +10257,7 @@
       </w:tblGrid>
       <w:tr>
         <w:trPr>
+          <w:cantSplit/>
           <w:tblHeader w:val="true"/>
         </w:trPr>
         <w:tc>
@@ -10185,6 +10331,7 @@
       </w:tr>
       <w:tr>
         <w:trPr>
+          <w:cantSplit/>
           <w:trHeight w:val="425" w:hRule="atLeast"/>
         </w:trPr>
         <w:tc>
@@ -10250,6 +10397,7 @@
       </w:tr>
       <w:tr>
         <w:trPr>
+          <w:cantSplit/>
           <w:trHeight w:val="425" w:hRule="atLeast"/>
         </w:trPr>
         <w:tc>
@@ -10315,6 +10463,7 @@
       </w:tr>
       <w:tr>
         <w:trPr>
+          <w:cantSplit/>
           <w:trHeight w:val="425" w:hRule="atLeast"/>
         </w:trPr>
         <w:tc>
@@ -10437,6 +10586,7 @@
       </w:tblGrid>
       <w:tr>
         <w:trPr>
+          <w:cantSplit/>
           <w:tblHeader w:val="true"/>
         </w:trPr>
         <w:tc>
@@ -10510,6 +10660,7 @@
       </w:tr>
       <w:tr>
         <w:trPr>
+          <w:cantSplit/>
           <w:trHeight w:val="425" w:hRule="atLeast"/>
         </w:trPr>
         <w:tc>
@@ -10576,6 +10727,7 @@
       </w:tr>
       <w:tr>
         <w:trPr>
+          <w:cantSplit/>
           <w:trHeight w:val="425" w:hRule="atLeast"/>
         </w:trPr>
         <w:tc>
@@ -10642,6 +10794,7 @@
       </w:tr>
       <w:tr>
         <w:trPr>
+          <w:cantSplit/>
           <w:trHeight w:val="425" w:hRule="atLeast"/>
         </w:trPr>
         <w:tc>
@@ -10708,6 +10861,7 @@
       </w:tr>
       <w:tr>
         <w:trPr>
+          <w:cantSplit/>
           <w:trHeight w:val="425" w:hRule="atLeast"/>
         </w:trPr>
         <w:tc>
@@ -10774,6 +10928,7 @@
       </w:tr>
       <w:tr>
         <w:trPr>
+          <w:cantSplit/>
           <w:trHeight w:val="425" w:hRule="atLeast"/>
         </w:trPr>
         <w:tc>
@@ -10840,6 +10995,7 @@
       </w:tr>
       <w:tr>
         <w:trPr>
+          <w:cantSplit/>
           <w:trHeight w:val="425" w:hRule="atLeast"/>
         </w:trPr>
         <w:tc>
@@ -10906,6 +11062,7 @@
       </w:tr>
       <w:tr>
         <w:trPr>
+          <w:cantSplit/>
           <w:trHeight w:val="425" w:hRule="atLeast"/>
         </w:trPr>
         <w:tc>
@@ -10989,6 +11146,7 @@
       </w:tblGrid>
       <w:tr>
         <w:trPr>
+          <w:cantSplit/>
           <w:trHeight w:val="425" w:hRule="atLeast"/>
         </w:trPr>
         <w:tc>
@@ -11127,6 +11285,7 @@
       </w:tblGrid>
       <w:tr>
         <w:trPr>
+          <w:cantSplit/>
           <w:tblHeader w:val="true"/>
         </w:trPr>
         <w:tc>
@@ -11183,6 +11342,7 @@
       </w:tr>
       <w:tr>
         <w:trPr>
+          <w:cantSplit/>
           <w:trHeight w:val="425" w:hRule="atLeast"/>
         </w:trPr>
         <w:tc>
@@ -11235,6 +11395,7 @@
       </w:tr>
       <w:tr>
         <w:trPr>
+          <w:cantSplit/>
           <w:trHeight w:val="425" w:hRule="atLeast"/>
         </w:trPr>
         <w:tc>
@@ -11287,6 +11448,7 @@
       </w:tr>
       <w:tr>
         <w:trPr>
+          <w:cantSplit/>
           <w:trHeight w:val="425" w:hRule="atLeast"/>
         </w:trPr>
         <w:tc>
@@ -11339,6 +11501,7 @@
       </w:tr>
       <w:tr>
         <w:trPr>
+          <w:cantSplit/>
           <w:trHeight w:val="425" w:hRule="atLeast"/>
         </w:trPr>
         <w:tc>
@@ -11391,6 +11554,7 @@
       </w:tr>
       <w:tr>
         <w:trPr>
+          <w:cantSplit/>
           <w:trHeight w:val="425" w:hRule="atLeast"/>
         </w:trPr>
         <w:tc>
@@ -11471,6 +11635,7 @@
       </w:tblGrid>
       <w:tr>
         <w:trPr>
+          <w:cantSplit/>
           <w:tblHeader w:val="true"/>
         </w:trPr>
         <w:tc>
@@ -11544,6 +11709,7 @@
       </w:tr>
       <w:tr>
         <w:trPr>
+          <w:cantSplit/>
           <w:trHeight w:val="567" w:hRule="atLeast"/>
         </w:trPr>
         <w:tc>
@@ -11610,6 +11776,7 @@
       </w:tr>
       <w:tr>
         <w:trPr>
+          <w:cantSplit/>
           <w:trHeight w:val="567" w:hRule="atLeast"/>
         </w:trPr>
         <w:tc>
@@ -11676,6 +11843,7 @@
       </w:tr>
       <w:tr>
         <w:trPr>
+          <w:cantSplit/>
           <w:trHeight w:val="567" w:hRule="atLeast"/>
         </w:trPr>
         <w:tc>
@@ -11742,6 +11910,7 @@
       </w:tr>
       <w:tr>
         <w:trPr>
+          <w:cantSplit/>
           <w:trHeight w:val="567" w:hRule="atLeast"/>
         </w:trPr>
         <w:tc>
@@ -11808,6 +11977,7 @@
       </w:tr>
       <w:tr>
         <w:trPr>
+          <w:cantSplit/>
           <w:trHeight w:val="567" w:hRule="atLeast"/>
         </w:trPr>
         <w:tc>
@@ -11934,6 +12104,7 @@
       </w:tblGrid>
       <w:tr>
         <w:trPr>
+          <w:cantSplit/>
           <w:trHeight w:val="425" w:hRule="atLeast"/>
         </w:trPr>
         <w:tc>
@@ -11978,6 +12149,7 @@
       </w:tr>
       <w:tr>
         <w:trPr>
+          <w:cantSplit/>
           <w:trHeight w:val="425" w:hRule="atLeast"/>
         </w:trPr>
         <w:tc>
@@ -12022,6 +12194,7 @@
       </w:tr>
       <w:tr>
         <w:trPr>
+          <w:cantSplit/>
           <w:trHeight w:val="425" w:hRule="atLeast"/>
         </w:trPr>
         <w:tc>
@@ -12066,6 +12239,7 @@
       </w:tr>
       <w:tr>
         <w:trPr>
+          <w:cantSplit/>
           <w:trHeight w:val="425" w:hRule="atLeast"/>
         </w:trPr>
         <w:tc>
@@ -12176,6 +12350,7 @@
       </w:tblGrid>
       <w:tr>
         <w:trPr>
+          <w:cantSplit/>
           <w:trHeight w:val="425" w:hRule="atLeast"/>
         </w:trPr>
         <w:tc>
@@ -12220,6 +12395,7 @@
       </w:tr>
       <w:tr>
         <w:trPr>
+          <w:cantSplit/>
           <w:trHeight w:val="425" w:hRule="atLeast"/>
         </w:trPr>
         <w:tc>
@@ -12264,6 +12440,7 @@
       </w:tr>
       <w:tr>
         <w:trPr>
+          <w:cantSplit/>
           <w:trHeight w:val="425" w:hRule="atLeast"/>
         </w:trPr>
         <w:tc>
@@ -12337,6 +12514,7 @@
       </w:tblGrid>
       <w:tr>
         <w:trPr>
+          <w:cantSplit/>
           <w:tblHeader w:val="true"/>
         </w:trPr>
         <w:tc>
@@ -12434,6 +12612,7 @@
       </w:tr>
       <w:tr>
         <w:trPr>
+          <w:cantSplit/>
           <w:trHeight w:val="425" w:hRule="atLeast"/>
         </w:trPr>
         <w:tc>
@@ -12515,6 +12694,7 @@
       </w:tr>
       <w:tr>
         <w:trPr>
+          <w:cantSplit/>
           <w:trHeight w:val="425" w:hRule="atLeast"/>
         </w:trPr>
         <w:tc>
@@ -12596,6 +12776,7 @@
       </w:tr>
       <w:tr>
         <w:trPr>
+          <w:cantSplit/>
           <w:trHeight w:val="425" w:hRule="atLeast"/>
         </w:trPr>
         <w:tc>
@@ -12677,6 +12858,7 @@
       </w:tr>
       <w:tr>
         <w:trPr>
+          <w:cantSplit/>
           <w:trHeight w:val="425" w:hRule="atLeast"/>
         </w:trPr>
         <w:tc>
@@ -12758,6 +12940,7 @@
       </w:tr>
       <w:tr>
         <w:trPr>
+          <w:cantSplit/>
           <w:trHeight w:val="425" w:hRule="atLeast"/>
         </w:trPr>
         <w:tc>
@@ -12887,6 +13070,7 @@
       </w:tblGrid>
       <w:tr>
         <w:trPr>
+          <w:cantSplit/>
           <w:trHeight w:val="425" w:hRule="atLeast"/>
         </w:trPr>
         <w:tc>
@@ -12931,6 +13115,7 @@
       </w:tr>
       <w:tr>
         <w:trPr>
+          <w:cantSplit/>
           <w:trHeight w:val="425" w:hRule="atLeast"/>
         </w:trPr>
         <w:tc>
@@ -12975,6 +13160,7 @@
       </w:tr>
       <w:tr>
         <w:trPr>
+          <w:cantSplit/>
           <w:trHeight w:val="425" w:hRule="atLeast"/>
         </w:trPr>
         <w:tc>
@@ -13019,6 +13205,7 @@
       </w:tr>
       <w:tr>
         <w:trPr>
+          <w:cantSplit/>
           <w:trHeight w:val="425" w:hRule="atLeast"/>
         </w:trPr>
         <w:tc>
@@ -13063,6 +13250,7 @@
       </w:tr>
       <w:tr>
         <w:trPr>
+          <w:cantSplit/>
           <w:trHeight w:val="425" w:hRule="atLeast"/>
         </w:trPr>
         <w:tc>
@@ -13107,6 +13295,7 @@
       </w:tr>
       <w:tr>
         <w:trPr>
+          <w:cantSplit/>
           <w:trHeight w:val="425" w:hRule="atLeast"/>
         </w:trPr>
         <w:tc>
@@ -13184,6 +13373,7 @@
       </w:tblGrid>
       <w:tr>
         <w:trPr>
+          <w:cantSplit/>
           <w:tblHeader w:val="true"/>
         </w:trPr>
         <w:tc>
@@ -13257,6 +13447,7 @@
       </w:tr>
       <w:tr>
         <w:trPr>
+          <w:cantSplit/>
           <w:trHeight w:val="425" w:hRule="atLeast"/>
         </w:trPr>
         <w:tc>
@@ -13322,6 +13513,7 @@
       </w:tr>
       <w:tr>
         <w:trPr>
+          <w:cantSplit/>
           <w:trHeight w:val="425" w:hRule="atLeast"/>
         </w:trPr>
         <w:tc>
@@ -13387,6 +13579,7 @@
       </w:tr>
       <w:tr>
         <w:trPr>
+          <w:cantSplit/>
           <w:trHeight w:val="425" w:hRule="atLeast"/>
         </w:trPr>
         <w:tc>
@@ -13509,6 +13702,7 @@
       </w:tblGrid>
       <w:tr>
         <w:trPr>
+          <w:cantSplit/>
           <w:tblHeader w:val="true"/>
         </w:trPr>
         <w:tc>
@@ -13582,6 +13776,7 @@
       </w:tr>
       <w:tr>
         <w:trPr>
+          <w:cantSplit/>
           <w:trHeight w:val="425" w:hRule="atLeast"/>
         </w:trPr>
         <w:tc>
@@ -13647,6 +13842,7 @@
       </w:tr>
       <w:tr>
         <w:trPr>
+          <w:cantSplit/>
           <w:trHeight w:val="425" w:hRule="atLeast"/>
         </w:trPr>
         <w:tc>
@@ -13712,6 +13908,7 @@
       </w:tr>
       <w:tr>
         <w:trPr>
+          <w:cantSplit/>
           <w:trHeight w:val="425" w:hRule="atLeast"/>
         </w:trPr>
         <w:tc>
@@ -13777,6 +13974,7 @@
       </w:tr>
       <w:tr>
         <w:trPr>
+          <w:cantSplit/>
           <w:trHeight w:val="425" w:hRule="atLeast"/>
         </w:trPr>
         <w:tc>
@@ -13859,6 +14057,7 @@
       </w:tblGrid>
       <w:tr>
         <w:trPr>
+          <w:cantSplit/>
           <w:trHeight w:val="425" w:hRule="atLeast"/>
         </w:trPr>
         <w:tc>
@@ -13997,6 +14196,7 @@
       </w:tblGrid>
       <w:tr>
         <w:trPr>
+          <w:cantSplit/>
           <w:tblHeader w:val="true"/>
         </w:trPr>
         <w:tc>
@@ -14053,6 +14253,7 @@
       </w:tr>
       <w:tr>
         <w:trPr>
+          <w:cantSplit/>
           <w:trHeight w:val="425" w:hRule="atLeast"/>
         </w:trPr>
         <w:tc>
@@ -14105,6 +14306,7 @@
       </w:tr>
       <w:tr>
         <w:trPr>
+          <w:cantSplit/>
           <w:trHeight w:val="425" w:hRule="atLeast"/>
         </w:trPr>
         <w:tc>
@@ -14157,6 +14359,7 @@
       </w:tr>
       <w:tr>
         <w:trPr>
+          <w:cantSplit/>
           <w:trHeight w:val="425" w:hRule="atLeast"/>
         </w:trPr>
         <w:tc>
@@ -14209,6 +14412,7 @@
       </w:tr>
       <w:tr>
         <w:trPr>
+          <w:cantSplit/>
           <w:trHeight w:val="425" w:hRule="atLeast"/>
         </w:trPr>
         <w:tc>
@@ -14261,6 +14465,7 @@
       </w:tr>
       <w:tr>
         <w:trPr>
+          <w:cantSplit/>
           <w:trHeight w:val="425" w:hRule="atLeast"/>
         </w:trPr>
         <w:tc>
@@ -14340,6 +14545,7 @@
       </w:tblGrid>
       <w:tr>
         <w:trPr>
+          <w:cantSplit/>
           <w:tblHeader w:val="true"/>
         </w:trPr>
         <w:tc>
@@ -14413,6 +14619,7 @@
       </w:tr>
       <w:tr>
         <w:trPr>
+          <w:cantSplit/>
           <w:trHeight w:val="567" w:hRule="atLeast"/>
         </w:trPr>
         <w:tc>
@@ -14479,6 +14686,7 @@
       </w:tr>
       <w:tr>
         <w:trPr>
+          <w:cantSplit/>
           <w:trHeight w:val="567" w:hRule="atLeast"/>
         </w:trPr>
         <w:tc>
@@ -14545,6 +14753,7 @@
       </w:tr>
       <w:tr>
         <w:trPr>
+          <w:cantSplit/>
           <w:trHeight w:val="567" w:hRule="atLeast"/>
         </w:trPr>
         <w:tc>
@@ -14611,6 +14820,7 @@
       </w:tr>
       <w:tr>
         <w:trPr>
+          <w:cantSplit/>
           <w:trHeight w:val="567" w:hRule="atLeast"/>
         </w:trPr>
         <w:tc>
@@ -14677,6 +14887,7 @@
       </w:tr>
       <w:tr>
         <w:trPr>
+          <w:cantSplit/>
           <w:trHeight w:val="567" w:hRule="atLeast"/>
         </w:trPr>
         <w:tc>
@@ -14842,6 +15053,14 @@
       </w:pPr>
       <w:r>
         <w:t>Акты освидетельствования ответственных конструкций и участков сетей инженерно-технического обеспечения — отдельные документы исполнительной документации (рекомендуемые образцы — приложения № 4 и № 5 к составу). Эти формы их не заменяют.</w:t>
+      </w:r>
+    </w:p>
+    <w:p>
+      <w:pPr>
+        <w:pStyle w:val="ListNumber"/>
+      </w:pPr>
+      <w:r>
+        <w:t>Перед печатью для подписания. Сохраните копию файла и оставьте в ней одну форму: от таблицы «Объект капитального строительства» до таблицы «Подписи» включительно. Остальное удалите: заголовок файла, заголовок формы и курсивную строку «Для …» под ним, другие формы, блок «Если есть замечания (в образец акта не входит)» после подписей и этот раздел. Внутри формы удалите три курсивные строки: «Поля комплекта (в рекомендуемый образец не входят)», «Номер в национальном реестре специалистов указывают…» и «Если документов больше пяти…»; указания двух последних сначала выполните. Остаются: таблицы с данными, строка «Проверено при осмотре, испытания и измерения (поля комплекта)» над таблицей проверок, пояснения в скобках под строками и курсивные пояснения к полям внутри ячеек.</w:t>
       </w:r>
     </w:p>
     <w:sectPr>

</xml_diff>

<commit_message>
Begin P3/P4 repackaging with complete Ministry forms and completeness gate
</commit_message>
<xml_diff>
--- a/products-storage/05-ks-bez-vozvrata/03-akt-skrytyh-rabot.docx
+++ b/products-storage/05-ks-bez-vozvrata/03-akt-skrytyh-rabot.docx
@@ -5,134 +5,3982 @@
     <w:p>
       <w:pPr>
         <w:pStyle w:val="Title"/>
+      </w:pPr>
+      <w:r>
+        <w:t>Вариант 1 Бетонирование</w:t>
+      </w:r>
+    </w:p>
+    <w:p>
+      <w:r>
+        <w:rPr>
+          <w:color w:val="8E6F32"/>
+          <w:sz w:val="18"/>
+        </w:rPr>
+        <w:t>Рекомендуемый образец приложения № 3 к составу исполнительной документации, утверждённому приказом Минстроя России от 16.05.2023 № 344/пр.</w:t>
+      </w:r>
+    </w:p>
+    <w:p>
+      <w:pPr>
+        <w:spacing w:after="160"/>
+      </w:pPr>
+      <w:r>
+        <w:t>Укажите фактические работы, место и проектные решения в пунктах 1 и 2. Материалы и результаты контроля внесите в пункты 3 и 4. Подписи оформите по составу участников освидетельствования, указанному в форме.</w:t>
+      </w:r>
+    </w:p>
+    <w:p>
+      <w:r>
+        <w:t>Укажите конструкцию, участок и отметки; материалы бетонной смеси и документы о качестве; результаты контроля, предусмотренные проектом. Определите, какие выполненные работы будут скрыты последующей операцией.</w:t>
+      </w:r>
+    </w:p>
+    <w:p>
+      <w:pPr>
+        <w:keepNext/>
+      </w:pPr>
+      <w:r>
+        <w:t>Объект капитального строительства</w:t>
+      </w:r>
+    </w:p>
+    <w:p>
+      <w:r>
+        <w:t>___________________________________________________________________________</w:t>
+      </w:r>
+    </w:p>
+    <w:p>
+      <w:r>
+        <w:rPr>
+          <w:sz w:val="18"/>
+        </w:rPr>
+        <w:t>(наименование объекта капитального строительства в соответствии с проектной документацией, почтовый или строительный адрес объекта капитального строительства)</w:t>
+      </w:r>
+    </w:p>
+    <w:p>
+      <w:pPr>
+        <w:keepNext/>
+      </w:pPr>
+      <w:r>
+        <w:t>Застройщик, технический заказчик, лицо, ответственное за эксплуатацию здания, сооружения, или региональный оператор</w:t>
+      </w:r>
+    </w:p>
+    <w:p>
+      <w:r>
+        <w:t>___________________________________________________________________________</w:t>
+      </w:r>
+    </w:p>
+    <w:p>
+      <w:r>
+        <w:rPr>
+          <w:sz w:val="18"/>
+        </w:rPr>
+        <w:t>(фамилия, имя, отчество (последнее - при наличии), адрес места жительства, ОГРНИП, ИНН индивидуального предпринимателя,</w:t>
+      </w:r>
+    </w:p>
+    <w:p>
+      <w:r>
+        <w:t>___________________________________________________________________________</w:t>
+      </w:r>
+    </w:p>
+    <w:p>
+      <w:r>
+        <w:t>полное и (или) сокращенное наименование, ОГРН, ИНН, адрес юридического лица в пределах его места нахождения, телефон или факс,</w:t>
+      </w:r>
+    </w:p>
+    <w:p>
+      <w:r>
+        <w:t>___________________________________________________________________________</w:t>
+      </w:r>
+    </w:p>
+    <w:p>
+      <w:r>
+        <w:t>полное и (или) сокращенное наименование, ОГРН, ИНН саморегулируемой организации, членом которой является указанное юридическое лицо или индивидуальный предприниматель (за исключением случаев, когда членство в саморегулируемых организациях в области строительства, реконструкции, капитального ремонта объектов капитального строительства не требуется);</w:t>
+      </w:r>
+    </w:p>
+    <w:p>
+      <w:r>
+        <w:t>___________________________________________________________________________</w:t>
+      </w:r>
+    </w:p>
+    <w:p>
+      <w:r>
+        <w:t>фамилия, имя, отчество (последнее - при наличии), паспортные данные, адрес места жительства, телефон или факс - для физических лиц, не являющихся индивидуальными предпринимателями)</w:t>
+      </w:r>
+    </w:p>
+    <w:p>
+      <w:pPr>
+        <w:keepNext/>
+      </w:pPr>
+      <w:r>
+        <w:t>Лицо, осуществляющее строительство, реконструкцию, капитальный ремонт</w:t>
+      </w:r>
+    </w:p>
+    <w:p>
+      <w:r>
+        <w:t>___________________________________________________________________________</w:t>
+      </w:r>
+    </w:p>
+    <w:p>
+      <w:r>
+        <w:rPr>
+          <w:sz w:val="18"/>
+        </w:rPr>
+        <w:t>(фамилия, имя, отчество (последнее - при наличии), адрес места жительства, ОГРНИП, ИНН индивидуального предпринимателя,</w:t>
+      </w:r>
+    </w:p>
+    <w:p>
+      <w:r>
+        <w:t>___________________________________________________________________________</w:t>
+      </w:r>
+    </w:p>
+    <w:p>
+      <w:r>
+        <w:t>полное и (или) сокращенное наименование, ОГРН, ИНН, адрес юридического лица в пределах его места нахождения, телефон или факс,</w:t>
+      </w:r>
+    </w:p>
+    <w:p>
+      <w:r>
+        <w:t>___________________________________________________________________________</w:t>
+      </w:r>
+    </w:p>
+    <w:p>
+      <w:r>
+        <w:t>полное и (или) сокращенное наименование, ОГРН, ИНН саморегулируемой организации, членом которой является указанное юридическое лицо или индивидуальный предприниматель (за исключением случаев, когда членство в саморегулируемых организациях в области строительства, реконструкции, капитального ремонта объектов капитального строительства не требуется)</w:t>
+      </w:r>
+    </w:p>
+    <w:p>
+      <w:pPr>
+        <w:keepNext/>
+      </w:pPr>
+      <w:r>
+        <w:t>Лицо, осуществляющее подготовку проектной документации</w:t>
+      </w:r>
+    </w:p>
+    <w:p>
+      <w:r>
+        <w:t>___________________________________________________________________________</w:t>
+      </w:r>
+    </w:p>
+    <w:p>
+      <w:r>
+        <w:rPr>
+          <w:sz w:val="18"/>
+        </w:rPr>
+        <w:t>(фамилия, имя, отчество (последнее - при наличии), адрес места жительства, ОГРНИП, ИНН индивидуального предпринимателя,</w:t>
+      </w:r>
+    </w:p>
+    <w:p>
+      <w:r>
+        <w:t>___________________________________________________________________________</w:t>
+      </w:r>
+    </w:p>
+    <w:p>
+      <w:r>
+        <w:t>полное и (или) сокращенное наименование, ОГРН, ИНН, адрес юридического лица в пределах его места нахождения, телефон или факс,</w:t>
+      </w:r>
+    </w:p>
+    <w:p>
+      <w:r>
+        <w:t>___________________________________________________________________________</w:t>
+      </w:r>
+    </w:p>
+    <w:p>
+      <w:r>
+        <w:t>полное и (или) сокращенное наименование, ОГРН, ИНН саморегулируемой организации, членом которой является указанное юридическое лицо или индивидуальный предприниматель (за исключением случаев, когда членство в саморегулируемых организациях в области архитектурно-строительного проектирования не требуется)</w:t>
+      </w:r>
+    </w:p>
+    <w:p>
+      <w:pPr>
+        <w:keepNext/>
         <w:jc w:val="center"/>
       </w:pPr>
       <w:r>
-        <w:t>5 ТИПОВЫХ ФОРМ актов скрытых работ (АОСР)</w:t>
-      </w:r>
-    </w:p>
-    <w:p/>
-    <w:p>
-      <w:pPr>
-        <w:pStyle w:val="Heading1"/>
-      </w:pPr>
-      <w:r>
-        <w:t>Форма 1. Акт освидетельствования скрытых работ (бетонирование)</w:t>
-      </w:r>
-    </w:p>
-    <w:p>
-      <w:r>
-        <w:t>[Шаблон акта с полями: наименование работ, место проведения, дата, представители заказчика / автора проекта / подрядчика, перечень выполненных работ, заключение комиссии, подписи]</w:t>
-      </w:r>
-    </w:p>
-    <w:p>
-      <w:pPr>
-        <w:pStyle w:val="Heading1"/>
-      </w:pPr>
-      <w:r>
-        <w:t>Форма 2. Акт освидетельствования скрытых работ (гидроизоляция)</w:t>
-      </w:r>
-    </w:p>
-    <w:p>
-      <w:r>
-        <w:t>[Шаблон с учетом специфики гидроизоляционных работ: проверка основания, качество материалов, технология нанесения]</w:t>
-      </w:r>
-    </w:p>
-    <w:p>
-      <w:pPr>
-        <w:pStyle w:val="Heading1"/>
-      </w:pPr>
-      <w:r>
-        <w:t>Форма 3. Акт освидетельствования скрытых работ (электромонтаж)</w:t>
-      </w:r>
-    </w:p>
-    <w:p>
-      <w:r>
-        <w:t>[Шаблон с полями для проверки прокладки кабелей, заземления, испытаний]</w:t>
-      </w:r>
-    </w:p>
-    <w:p>
-      <w:pPr>
-        <w:pStyle w:val="Heading1"/>
-      </w:pPr>
-      <w:r>
-        <w:t>Форма 4. Акт освидетельствования скрытых работ (отопление/водоснабжение)</w:t>
-      </w:r>
-    </w:p>
-    <w:p>
-      <w:r>
-        <w:t>[Шаблон с проверкой опрессовки, герметичности, материалов труб]</w:t>
-      </w:r>
-    </w:p>
-    <w:p>
-      <w:pPr>
-        <w:pStyle w:val="Heading1"/>
-      </w:pPr>
-      <w:r>
-        <w:t>Форма 5. Акт освидетельствования скрытых работ (общий)</w:t>
-      </w:r>
-    </w:p>
-    <w:p>
-      <w:r>
-        <w:t>[Универсальный шаблон для работ, не попадающих под типовые формы]</w:t>
-      </w:r>
-    </w:p>
-    <w:p>
-      <w:pPr>
-        <w:pStyle w:val="Heading1"/>
-      </w:pPr>
-      <w:r>
-        <w:t>Примечания к использованию</w:t>
-      </w:r>
-    </w:p>
-    <w:p>
-      <w:pPr>
-        <w:pStyle w:val="ListNumber"/>
-      </w:pPr>
-      <w:r>
-        <w:t>Каждая форма содержит все обязательные реквизиты по СП 48.13330.2019.</w:t>
-      </w:r>
-    </w:p>
-    <w:p>
-      <w:pPr>
-        <w:pStyle w:val="ListNumber"/>
-      </w:pPr>
-      <w:r>
-        <w:t>Поля отмечены [квадратными скобками] для заполнения.</w:t>
-      </w:r>
-    </w:p>
-    <w:p>
-      <w:pPr>
-        <w:pStyle w:val="ListNumber"/>
-      </w:pPr>
-      <w:r>
-        <w:t>Подписи всех трех сторон обязательны (заказчик, автор проекта, подрядчик).</w:t>
-      </w:r>
-    </w:p>
-    <w:p>
-      <w:pPr>
-        <w:pStyle w:val="ListNumber"/>
-      </w:pPr>
-      <w:r>
-        <w:t>Дата акта должна быть не позже даты окончания периода КС-2.</w:t>
-      </w:r>
-    </w:p>
-    <w:p>
-      <w:pPr>
-        <w:pStyle w:val="ListNumber"/>
-      </w:pPr>
-      <w:r>
-        <w:t>Акты хранятся вместе с КС-2 как неотъемлемое приложение.</w:t>
+        <w:rPr>
+          <w:b/>
+          <w:sz w:val="24"/>
+        </w:rPr>
+        <w:t>АКТ</w:t>
+      </w:r>
+    </w:p>
+    <w:p>
+      <w:pPr>
+        <w:keepNext/>
+        <w:jc w:val="center"/>
+      </w:pPr>
+      <w:r>
+        <w:rPr>
+          <w:b/>
+          <w:sz w:val="24"/>
+        </w:rPr>
+        <w:t>освидетельствования скрытых работ</w:t>
+      </w:r>
+    </w:p>
+    <w:p>
+      <w:pPr>
+        <w:keepNext/>
+      </w:pPr>
+      <w:r>
+        <w:t>N __________ "__" _____________ 20__ г. (дата составления акта)</w:t>
+      </w:r>
+    </w:p>
+    <w:p>
+      <w:pPr>
+        <w:keepNext/>
+      </w:pPr>
+      <w:r>
+        <w:t>Представитель застройщика, технического заказчика, лица, ответственного за эксплуатацию здания, сооружения, или регионального оператора по вопросам строительного контроля</w:t>
+      </w:r>
+    </w:p>
+    <w:p>
+      <w:r>
+        <w:t>___________________________________________________________________________</w:t>
+      </w:r>
+    </w:p>
+    <w:p>
+      <w:r>
+        <w:rPr>
+          <w:sz w:val="18"/>
+        </w:rPr>
+        <w:t>(должность (при наличии), фамилия, инициалы, идентификационный номер в национальном реестре специалистов в области строительства (за исключением случаев, когда членство в саморегулируемых организациях в области строительства, реконструкции, капитального ремонта объектов капитального строительства не требуется),</w:t>
+      </w:r>
+    </w:p>
+    <w:p>
+      <w:r>
+        <w:t>___________________________________________________________________________</w:t>
+      </w:r>
+    </w:p>
+    <w:p>
+      <w:r>
+        <w:t>реквизиты распорядительного документа, подтверждающего полномочия,</w:t>
+      </w:r>
+    </w:p>
+    <w:p>
+      <w:r>
+        <w:t>___________________________________________________________________________</w:t>
+      </w:r>
+    </w:p>
+    <w:p>
+      <w:r>
+        <w:t>с указанием полного и (или) сокращенного наименования, ОГРН, ИНН, адреса юридического лица в пределах его места нахождения (в случае осуществления строительного контроля на основании договора с застройщиком или техническим заказчиком),</w:t>
+      </w:r>
+    </w:p>
+    <w:p>
+      <w:r>
+        <w:t>___________________________________________________________________________</w:t>
+      </w:r>
+    </w:p>
+    <w:p>
+      <w:r>
+        <w:t>фамилии, имени, отчества (последнее - при наличии), адреса места жительства, ОГРНИП, ИНН индивидуального предпринимателя (в случае осуществления строительного контроля на основании договора с застройщиком или техническим заказчиком)</w:t>
+      </w:r>
+    </w:p>
+    <w:p>
+      <w:pPr>
+        <w:keepNext/>
+      </w:pPr>
+      <w:r>
+        <w:t>Представитель лица, осуществляющего строительство, реконструкцию, капитальный ремонт</w:t>
+      </w:r>
+    </w:p>
+    <w:p>
+      <w:r>
+        <w:t>___________________________________________________________________________</w:t>
+      </w:r>
+    </w:p>
+    <w:p>
+      <w:r>
+        <w:rPr>
+          <w:sz w:val="18"/>
+        </w:rPr>
+        <w:t>(должность (при наличии), фамилия, инициалы, реквизиты распорядительного документа, подтверждающего полномочия)</w:t>
+      </w:r>
+    </w:p>
+    <w:p>
+      <w:pPr>
+        <w:keepNext/>
+      </w:pPr>
+      <w:r>
+        <w:t>Представитель лица, осуществляющего строительство, реконструкцию, капитальный ремонт, по вопросам строительного контроля</w:t>
+      </w:r>
+    </w:p>
+    <w:p>
+      <w:r>
+        <w:t>___________________________________________________________________________</w:t>
+      </w:r>
+    </w:p>
+    <w:p>
+      <w:r>
+        <w:rPr>
+          <w:sz w:val="18"/>
+        </w:rPr>
+        <w:t>(должность (при наличии), фамилия, инициалы, идентификационный номер в национальном реестре специалистов в области строительства (за исключением случаев, когда членство в саморегулируемых организациях в области строительства, реконструкции, капитального ремонта объектов капитального строительства не требуется),</w:t>
+      </w:r>
+    </w:p>
+    <w:p>
+      <w:r>
+        <w:t>___________________________________________________________________________</w:t>
+      </w:r>
+    </w:p>
+    <w:p>
+      <w:r>
+        <w:t>реквизиты распорядительного документа, подтверждающего полномочия)</w:t>
+      </w:r>
+    </w:p>
+    <w:p>
+      <w:pPr>
+        <w:keepNext/>
+      </w:pPr>
+      <w:r>
+        <w:t>Представитель лица, осуществляющего подготовку проектной документации (в случае привлечения застройщиком лица, осуществляющего подготовку проектной документации, для проверки соответствия выполняемых работ проектной документации согласно части 2 статьи 53 Градостроительного кодекса Российской Федерации)</w:t>
+      </w:r>
+    </w:p>
+    <w:p>
+      <w:r>
+        <w:t>___________________________________________________________________________</w:t>
+      </w:r>
+    </w:p>
+    <w:p>
+      <w:r>
+        <w:rPr>
+          <w:sz w:val="18"/>
+        </w:rPr>
+        <w:t>(должность (при наличии), фамилия, инициалы, реквизиты распорядительного документа, подтверждающего полномочия,</w:t>
+      </w:r>
+    </w:p>
+    <w:p>
+      <w:r>
+        <w:t>___________________________________________________________________________</w:t>
+      </w:r>
+    </w:p>
+    <w:p>
+      <w:r>
+        <w:t>с указанием полного и (или) сокращенного наименования, ОГРН, ИНН, адреса юридического лица в пределах его места нахождения,</w:t>
+      </w:r>
+    </w:p>
+    <w:p>
+      <w:r>
+        <w:t>___________________________________________________________________________</w:t>
+      </w:r>
+    </w:p>
+    <w:p>
+      <w:r>
+        <w:t>фамилии, имени, отчества (последнее - при наличии), адреса места жительства, ОГРНИП, ИНН индивидуального предпринимателя)</w:t>
+      </w:r>
+    </w:p>
+    <w:p>
+      <w:pPr>
+        <w:keepNext/>
+      </w:pPr>
+      <w:r>
+        <w:t>Представитель лица, выполнившего работы, подлежащие освидетельствованию (в случае выполнения работ по договорам о строительстве, реконструкции, капитальном ремонте объектов капитального строительства, заключенным с иными лицами)</w:t>
+      </w:r>
+    </w:p>
+    <w:p>
+      <w:r>
+        <w:t>___________________________________________________________________________</w:t>
+      </w:r>
+    </w:p>
+    <w:p>
+      <w:r>
+        <w:rPr>
+          <w:sz w:val="18"/>
+        </w:rPr>
+        <w:t>(должность (при наличии), фамилия, инициалы, реквизиты распорядительного документа, подтверждающего полномочия,</w:t>
+      </w:r>
+    </w:p>
+    <w:p>
+      <w:r>
+        <w:t>___________________________________________________________________________</w:t>
+      </w:r>
+    </w:p>
+    <w:p>
+      <w:r>
+        <w:t>с указанием полного и (или) сокращенного наименования, ОГРН, ИНН, адреса юридического лица в пределах его места нахождения,</w:t>
+      </w:r>
+    </w:p>
+    <w:p>
+      <w:r>
+        <w:t>___________________________________________________________________________</w:t>
+      </w:r>
+    </w:p>
+    <w:p>
+      <w:r>
+        <w:t>фамилии, имени, отчества (последнее - при наличии), адреса места жительства, ОГРНИП, ИНН индивидуального предпринимателя)</w:t>
+      </w:r>
+    </w:p>
+    <w:p>
+      <w:pPr>
+        <w:keepNext/>
+      </w:pPr>
+      <w:r>
+        <w:t>произвели осмотр работ, выполненных</w:t>
+      </w:r>
+    </w:p>
+    <w:p>
+      <w:r>
+        <w:t>__________________________________________________________________________,</w:t>
+      </w:r>
+    </w:p>
+    <w:p>
+      <w:r>
+        <w:rPr>
+          <w:sz w:val="18"/>
+        </w:rPr>
+        <w:t>(полное и (или) сокращенное наименование или фамилия, имя, отчество (последнее - при наличии) лица, выполнившего работы, подлежащие освидетельствованию)</w:t>
+      </w:r>
+    </w:p>
+    <w:p>
+      <w:pPr>
+        <w:keepNext/>
+      </w:pPr>
+      <w:r>
+        <w:t>и составили настоящий акт о нижеследующем:</w:t>
+      </w:r>
+    </w:p>
+    <w:p>
+      <w:pPr>
+        <w:keepNext/>
+      </w:pPr>
+      <w:r>
+        <w:rPr>
+          <w:b/>
+        </w:rPr>
+        <w:t>1. К освидетельствованию предъявлены следующие работы:</w:t>
+      </w:r>
+    </w:p>
+    <w:p>
+      <w:r>
+        <w:t>___________________________________________________________________________</w:t>
+      </w:r>
+    </w:p>
+    <w:p>
+      <w:r>
+        <w:rPr>
+          <w:sz w:val="18"/>
+        </w:rPr>
+        <w:t>(наименование скрытых работ)</w:t>
+      </w:r>
+    </w:p>
+    <w:p>
+      <w:pPr>
+        <w:keepNext/>
+      </w:pPr>
+      <w:r>
+        <w:rPr>
+          <w:b/>
+        </w:rPr>
+        <w:t>2. Работы выполнены по проектной документации</w:t>
+      </w:r>
+    </w:p>
+    <w:p>
+      <w:r>
+        <w:t>___________________________________________________________________________</w:t>
+      </w:r>
+    </w:p>
+    <w:p>
+      <w:r>
+        <w:rPr>
+          <w:sz w:val="18"/>
+        </w:rPr>
+        <w:t>(номер, другие реквизиты чертежа, наименование проектной и (или) рабочей</w:t>
+      </w:r>
+    </w:p>
+    <w:p>
+      <w:r>
+        <w:t>___________________________________________________________________________</w:t>
+      </w:r>
+    </w:p>
+    <w:p>
+      <w:r>
+        <w:t>документации, сведения о лицах, осуществляющих подготовку раздела проектной и (или) рабочей документации)</w:t>
+      </w:r>
+    </w:p>
+    <w:p>
+      <w:pPr>
+        <w:keepNext/>
+      </w:pPr>
+      <w:r>
+        <w:rPr>
+          <w:b/>
+        </w:rPr>
+        <w:t>3. При выполнении работ применены _________________________________________ (наименования строительных материалов</w:t>
+      </w:r>
+    </w:p>
+    <w:p>
+      <w:r>
+        <w:t>___________________________________________________________________________</w:t>
+      </w:r>
+    </w:p>
+    <w:p>
+      <w:r>
+        <w:rPr>
+          <w:sz w:val="18"/>
+        </w:rPr>
+        <w:t>(изделий), реквизиты сертификатов и (или) других документов, подтверждающих их качество и безопасность, в случае если необходимо указывать более 5 документов, указывается ссылка на их реестр, который является неотъемлемой частью акта)</w:t>
+      </w:r>
+    </w:p>
+    <w:p>
+      <w:pPr>
+        <w:keepNext/>
+      </w:pPr>
+      <w:r>
+        <w:rPr>
+          <w:b/>
+        </w:rPr>
+        <w:t>4. Предъявлены документы, подтверждающие соответствие работ предъявляемым к ним требованиям</w:t>
+      </w:r>
+    </w:p>
+    <w:p>
+      <w:r>
+        <w:t>___________________________________________________________________________</w:t>
+      </w:r>
+    </w:p>
+    <w:p>
+      <w:r>
+        <w:rPr>
+          <w:sz w:val="18"/>
+        </w:rPr>
+        <w:t>(исполнительные схемы и чертежи, результаты экспертиз, обследований,</w:t>
+      </w:r>
+    </w:p>
+    <w:p>
+      <w:r>
+        <w:t>___________________________________________________________________________</w:t>
+      </w:r>
+    </w:p>
+    <w:p>
+      <w:r>
+        <w:t>лабораторных и иных испытаний выполненных работ, проведенных в процессе строительного контроля)</w:t>
+      </w:r>
+    </w:p>
+    <w:p>
+      <w:pPr>
+        <w:keepNext/>
+      </w:pPr>
+      <w:r>
+        <w:rPr>
+          <w:b/>
+        </w:rPr>
+        <w:t>5. Даты: начала работ "__" ___________ 20__ г. окончания работ "__" ___________ 20__ г.</w:t>
+      </w:r>
+    </w:p>
+    <w:p>
+      <w:pPr>
+        <w:keepNext/>
+      </w:pPr>
+      <w:r>
+        <w:rPr>
+          <w:b/>
+        </w:rPr>
+        <w:t>6. Работы выполнены в соответствии с</w:t>
+      </w:r>
+    </w:p>
+    <w:p>
+      <w:r>
+        <w:t>___________________________________________________________________________</w:t>
+      </w:r>
+    </w:p>
+    <w:p>
+      <w:r>
+        <w:rPr>
+          <w:sz w:val="18"/>
+        </w:rPr>
+        <w:t>(наименования и структурные единицы технических регламентов,</w:t>
+      </w:r>
+    </w:p>
+    <w:p>
+      <w:r>
+        <w:t>___________________________________________________________________________</w:t>
+      </w:r>
+    </w:p>
+    <w:p>
+      <w:r>
+        <w:t>иных нормативных правовых актов, разделы проектной и (или) рабочей документации)</w:t>
+      </w:r>
+    </w:p>
+    <w:p>
+      <w:pPr>
+        <w:keepNext/>
+      </w:pPr>
+      <w:r>
+        <w:rPr>
+          <w:b/>
+        </w:rPr>
+        <w:t>7. Разрешается производство последующих работ</w:t>
+      </w:r>
+    </w:p>
+    <w:p>
+      <w:r>
+        <w:t>___________________________________________________________________________</w:t>
+      </w:r>
+    </w:p>
+    <w:p>
+      <w:r>
+        <w:rPr>
+          <w:sz w:val="18"/>
+        </w:rPr>
+        <w:t>(наименования работ, строительных конструкций, участков сетей инженерно-технического обеспечения)</w:t>
+      </w:r>
+    </w:p>
+    <w:p>
+      <w:pPr>
+        <w:keepNext/>
+      </w:pPr>
+      <w:r>
+        <w:t>Дополнительные сведения ___________________________________________________</w:t>
+      </w:r>
+    </w:p>
+    <w:p>
+      <w:pPr>
+        <w:keepNext/>
+      </w:pPr>
+      <w:r>
+        <w:t>Акт составлен в _________ экземплярах (в случае заполнения акта на бумажном носителе).</w:t>
+      </w:r>
+    </w:p>
+    <w:p>
+      <w:pPr>
+        <w:keepNext/>
+      </w:pPr>
+      <w:r>
+        <w:t>Приложения ________________________________________________________________ (исполнительные схемы и чертежи, результаты экспертиз, обследований, лабораторных и иных испытаний)</w:t>
+      </w:r>
+    </w:p>
+    <w:p>
+      <w:pPr>
+        <w:keepNext/>
+        <w:pageBreakBefore/>
+        <w:spacing w:after="140"/>
+      </w:pPr>
+      <w:r>
+        <w:t>Представитель застройщика, технического заказчика, лица, ответственного за эксплуатацию здания, сооружения, или регионального оператора по вопросам строительного контроля</w:t>
+      </w:r>
+    </w:p>
+    <w:p>
+      <w:pPr>
+        <w:keepNext/>
+        <w:spacing w:after="140"/>
+      </w:pPr>
+      <w:r>
+        <w:t>___________________________ ______________</w:t>
+      </w:r>
+    </w:p>
+    <w:p>
+      <w:pPr>
+        <w:spacing w:after="140"/>
+      </w:pPr>
+      <w:r>
+        <w:rPr>
+          <w:sz w:val="18"/>
+        </w:rPr>
+        <w:t>(фамилия, инициалы) (подпись)</w:t>
+      </w:r>
+    </w:p>
+    <w:p>
+      <w:pPr>
+        <w:keepNext/>
+        <w:spacing w:after="140"/>
+      </w:pPr>
+      <w:r>
+        <w:t>Представитель лица, осуществляющего строительство, реконструкцию, капитальный ремонт</w:t>
+      </w:r>
+    </w:p>
+    <w:p>
+      <w:pPr>
+        <w:keepNext/>
+        <w:spacing w:after="140"/>
+      </w:pPr>
+      <w:r>
+        <w:t>___________________________ ______________</w:t>
+      </w:r>
+    </w:p>
+    <w:p>
+      <w:pPr>
+        <w:spacing w:after="140"/>
+      </w:pPr>
+      <w:r>
+        <w:rPr>
+          <w:sz w:val="18"/>
+        </w:rPr>
+        <w:t>(фамилия, инициалы) (подпись)</w:t>
+      </w:r>
+    </w:p>
+    <w:p>
+      <w:pPr>
+        <w:keepNext/>
+        <w:spacing w:after="140"/>
+      </w:pPr>
+      <w:r>
+        <w:t>Представитель лица, осуществляющего строительство, реконструкцию, капитальный ремонт, по вопросам строительного контроля</w:t>
+      </w:r>
+    </w:p>
+    <w:p>
+      <w:pPr>
+        <w:keepNext/>
+        <w:spacing w:after="140"/>
+      </w:pPr>
+      <w:r>
+        <w:t>___________________________ ______________</w:t>
+      </w:r>
+    </w:p>
+    <w:p>
+      <w:pPr>
+        <w:spacing w:after="140"/>
+      </w:pPr>
+      <w:r>
+        <w:rPr>
+          <w:sz w:val="18"/>
+        </w:rPr>
+        <w:t>(фамилия, инициалы) (подпись)</w:t>
+      </w:r>
+    </w:p>
+    <w:p>
+      <w:pPr>
+        <w:keepNext/>
+        <w:spacing w:after="140"/>
+      </w:pPr>
+      <w:r>
+        <w:t>Представитель лица, осуществляющего подготовку проектной документации (в случае привлечения застройщиком лица, осуществляющего подготовку проектной документации, для проверки соответствия выполняемых работ проектной документации согласно части 2 статьи 53 Градостроительного кодекса Российской Федерации)</w:t>
+      </w:r>
+    </w:p>
+    <w:p>
+      <w:pPr>
+        <w:keepNext/>
+        <w:spacing w:after="140"/>
+      </w:pPr>
+      <w:r>
+        <w:t>___________________________ ______________</w:t>
+      </w:r>
+    </w:p>
+    <w:p>
+      <w:pPr>
+        <w:spacing w:after="140"/>
+      </w:pPr>
+      <w:r>
+        <w:rPr>
+          <w:sz w:val="18"/>
+        </w:rPr>
+        <w:t>(фамилия, инициалы) (подпись)</w:t>
+      </w:r>
+    </w:p>
+    <w:p>
+      <w:pPr>
+        <w:keepNext/>
+        <w:spacing w:after="140"/>
+      </w:pPr>
+      <w:r>
+        <w:t>Представитель лица, выполнившего работы, подлежащие освидетельствованию (в случае выполнения работ по договорам о строительстве, реконструкции, капитальном ремонте объектов капитального строительства, заключенным с иными лицами)</w:t>
+      </w:r>
+    </w:p>
+    <w:p>
+      <w:pPr>
+        <w:keepNext/>
+        <w:spacing w:after="140"/>
+      </w:pPr>
+      <w:r>
+        <w:t>___________________________ ______________</w:t>
+      </w:r>
+    </w:p>
+    <w:p>
+      <w:pPr>
+        <w:spacing w:after="140"/>
+      </w:pPr>
+      <w:r>
+        <w:rPr>
+          <w:sz w:val="18"/>
+        </w:rPr>
+        <w:t>(фамилия, инициалы) (подпись)</w:t>
+      </w:r>
+    </w:p>
+    <w:p>
+      <w:r>
+        <w:br w:type="page"/>
+      </w:r>
+    </w:p>
+    <w:p>
+      <w:pPr>
+        <w:pStyle w:val="Title"/>
+      </w:pPr>
+      <w:r>
+        <w:t>Вариант 2 Гидроизоляция</w:t>
+      </w:r>
+    </w:p>
+    <w:p>
+      <w:r>
+        <w:rPr>
+          <w:color w:val="8E6F32"/>
+          <w:sz w:val="18"/>
+        </w:rPr>
+        <w:t>Рекомендуемый образец приложения № 3 к составу исполнительной документации, утверждённому приказом Минстроя России от 16.05.2023 № 344/пр.</w:t>
+      </w:r>
+    </w:p>
+    <w:p>
+      <w:pPr>
+        <w:spacing w:after="160"/>
+      </w:pPr>
+      <w:r>
+        <w:t>Укажите фактические работы, место и проектные решения в пунктах 1 и 2. Материалы и результаты контроля внесите в пункты 3 и 4. Подписи оформите по составу участников освидетельствования, указанному в форме.</w:t>
+      </w:r>
+    </w:p>
+    <w:p>
+      <w:r>
+        <w:t>Укажите основание, участок, материал, число слоёв и проектную толщину; приложите документы о качестве и результаты предусмотренного проектом контроля.</w:t>
+      </w:r>
+    </w:p>
+    <w:p>
+      <w:pPr>
+        <w:keepNext/>
+      </w:pPr>
+      <w:r>
+        <w:t>Объект капитального строительства</w:t>
+      </w:r>
+    </w:p>
+    <w:p>
+      <w:r>
+        <w:t>___________________________________________________________________________</w:t>
+      </w:r>
+    </w:p>
+    <w:p>
+      <w:r>
+        <w:rPr>
+          <w:sz w:val="18"/>
+        </w:rPr>
+        <w:t>(наименование объекта капитального строительства в соответствии с проектной документацией, почтовый или строительный адрес объекта капитального строительства)</w:t>
+      </w:r>
+    </w:p>
+    <w:p>
+      <w:pPr>
+        <w:keepNext/>
+      </w:pPr>
+      <w:r>
+        <w:t>Застройщик, технический заказчик, лицо, ответственное за эксплуатацию здания, сооружения, или региональный оператор</w:t>
+      </w:r>
+    </w:p>
+    <w:p>
+      <w:r>
+        <w:t>___________________________________________________________________________</w:t>
+      </w:r>
+    </w:p>
+    <w:p>
+      <w:r>
+        <w:rPr>
+          <w:sz w:val="18"/>
+        </w:rPr>
+        <w:t>(фамилия, имя, отчество (последнее - при наличии), адрес места жительства, ОГРНИП, ИНН индивидуального предпринимателя,</w:t>
+      </w:r>
+    </w:p>
+    <w:p>
+      <w:r>
+        <w:t>___________________________________________________________________________</w:t>
+      </w:r>
+    </w:p>
+    <w:p>
+      <w:r>
+        <w:t>полное и (или) сокращенное наименование, ОГРН, ИНН, адрес юридического лица в пределах его места нахождения, телефон или факс,</w:t>
+      </w:r>
+    </w:p>
+    <w:p>
+      <w:r>
+        <w:t>___________________________________________________________________________</w:t>
+      </w:r>
+    </w:p>
+    <w:p>
+      <w:r>
+        <w:t>полное и (или) сокращенное наименование, ОГРН, ИНН саморегулируемой организации, членом которой является указанное юридическое лицо или индивидуальный предприниматель (за исключением случаев, когда членство в саморегулируемых организациях в области строительства, реконструкции, капитального ремонта объектов капитального строительства не требуется);</w:t>
+      </w:r>
+    </w:p>
+    <w:p>
+      <w:r>
+        <w:t>___________________________________________________________________________</w:t>
+      </w:r>
+    </w:p>
+    <w:p>
+      <w:r>
+        <w:t>фамилия, имя, отчество (последнее - при наличии), паспортные данные, адрес места жительства, телефон или факс - для физических лиц, не являющихся индивидуальными предпринимателями)</w:t>
+      </w:r>
+    </w:p>
+    <w:p>
+      <w:pPr>
+        <w:keepNext/>
+      </w:pPr>
+      <w:r>
+        <w:t>Лицо, осуществляющее строительство, реконструкцию, капитальный ремонт</w:t>
+      </w:r>
+    </w:p>
+    <w:p>
+      <w:r>
+        <w:t>___________________________________________________________________________</w:t>
+      </w:r>
+    </w:p>
+    <w:p>
+      <w:r>
+        <w:rPr>
+          <w:sz w:val="18"/>
+        </w:rPr>
+        <w:t>(фамилия, имя, отчество (последнее - при наличии), адрес места жительства, ОГРНИП, ИНН индивидуального предпринимателя,</w:t>
+      </w:r>
+    </w:p>
+    <w:p>
+      <w:r>
+        <w:t>___________________________________________________________________________</w:t>
+      </w:r>
+    </w:p>
+    <w:p>
+      <w:r>
+        <w:t>полное и (или) сокращенное наименование, ОГРН, ИНН, адрес юридического лица в пределах его места нахождения, телефон или факс,</w:t>
+      </w:r>
+    </w:p>
+    <w:p>
+      <w:r>
+        <w:t>___________________________________________________________________________</w:t>
+      </w:r>
+    </w:p>
+    <w:p>
+      <w:r>
+        <w:t>полное и (или) сокращенное наименование, ОГРН, ИНН саморегулируемой организации, членом которой является указанное юридическое лицо или индивидуальный предприниматель (за исключением случаев, когда членство в саморегулируемых организациях в области строительства, реконструкции, капитального ремонта объектов капитального строительства не требуется)</w:t>
+      </w:r>
+    </w:p>
+    <w:p>
+      <w:pPr>
+        <w:keepNext/>
+      </w:pPr>
+      <w:r>
+        <w:t>Лицо, осуществляющее подготовку проектной документации</w:t>
+      </w:r>
+    </w:p>
+    <w:p>
+      <w:r>
+        <w:t>___________________________________________________________________________</w:t>
+      </w:r>
+    </w:p>
+    <w:p>
+      <w:r>
+        <w:rPr>
+          <w:sz w:val="18"/>
+        </w:rPr>
+        <w:t>(фамилия, имя, отчество (последнее - при наличии), адрес места жительства, ОГРНИП, ИНН индивидуального предпринимателя,</w:t>
+      </w:r>
+    </w:p>
+    <w:p>
+      <w:r>
+        <w:t>___________________________________________________________________________</w:t>
+      </w:r>
+    </w:p>
+    <w:p>
+      <w:r>
+        <w:t>полное и (или) сокращенное наименование, ОГРН, ИНН, адрес юридического лица в пределах его места нахождения, телефон или факс,</w:t>
+      </w:r>
+    </w:p>
+    <w:p>
+      <w:r>
+        <w:t>___________________________________________________________________________</w:t>
+      </w:r>
+    </w:p>
+    <w:p>
+      <w:r>
+        <w:t>полное и (или) сокращенное наименование, ОГРН, ИНН саморегулируемой организации, членом которой является указанное юридическое лицо или индивидуальный предприниматель (за исключением случаев, когда членство в саморегулируемых организациях в области архитектурно-строительного проектирования не требуется)</w:t>
+      </w:r>
+    </w:p>
+    <w:p>
+      <w:pPr>
+        <w:keepNext/>
+        <w:jc w:val="center"/>
+      </w:pPr>
+      <w:r>
+        <w:rPr>
+          <w:b/>
+          <w:sz w:val="24"/>
+        </w:rPr>
+        <w:t>АКТ</w:t>
+      </w:r>
+    </w:p>
+    <w:p>
+      <w:pPr>
+        <w:keepNext/>
+        <w:jc w:val="center"/>
+      </w:pPr>
+      <w:r>
+        <w:rPr>
+          <w:b/>
+          <w:sz w:val="24"/>
+        </w:rPr>
+        <w:t>освидетельствования скрытых работ</w:t>
+      </w:r>
+    </w:p>
+    <w:p>
+      <w:pPr>
+        <w:keepNext/>
+      </w:pPr>
+      <w:r>
+        <w:t>N __________ "__" _____________ 20__ г. (дата составления акта)</w:t>
+      </w:r>
+    </w:p>
+    <w:p>
+      <w:pPr>
+        <w:keepNext/>
+      </w:pPr>
+      <w:r>
+        <w:t>Представитель застройщика, технического заказчика, лица, ответственного за эксплуатацию здания, сооружения, или регионального оператора по вопросам строительного контроля</w:t>
+      </w:r>
+    </w:p>
+    <w:p>
+      <w:r>
+        <w:t>___________________________________________________________________________</w:t>
+      </w:r>
+    </w:p>
+    <w:p>
+      <w:r>
+        <w:rPr>
+          <w:sz w:val="18"/>
+        </w:rPr>
+        <w:t>(должность (при наличии), фамилия, инициалы, идентификационный номер в национальном реестре специалистов в области строительства (за исключением случаев, когда членство в саморегулируемых организациях в области строительства, реконструкции, капитального ремонта объектов капитального строительства не требуется),</w:t>
+      </w:r>
+    </w:p>
+    <w:p>
+      <w:r>
+        <w:t>___________________________________________________________________________</w:t>
+      </w:r>
+    </w:p>
+    <w:p>
+      <w:r>
+        <w:t>реквизиты распорядительного документа, подтверждающего полномочия,</w:t>
+      </w:r>
+    </w:p>
+    <w:p>
+      <w:r>
+        <w:t>___________________________________________________________________________</w:t>
+      </w:r>
+    </w:p>
+    <w:p>
+      <w:r>
+        <w:t>с указанием полного и (или) сокращенного наименования, ОГРН, ИНН, адреса юридического лица в пределах его места нахождения (в случае осуществления строительного контроля на основании договора с застройщиком или техническим заказчиком),</w:t>
+      </w:r>
+    </w:p>
+    <w:p>
+      <w:r>
+        <w:t>___________________________________________________________________________</w:t>
+      </w:r>
+    </w:p>
+    <w:p>
+      <w:r>
+        <w:t>фамилии, имени, отчества (последнее - при наличии), адреса места жительства, ОГРНИП, ИНН индивидуального предпринимателя (в случае осуществления строительного контроля на основании договора с застройщиком или техническим заказчиком)</w:t>
+      </w:r>
+    </w:p>
+    <w:p>
+      <w:pPr>
+        <w:keepNext/>
+      </w:pPr>
+      <w:r>
+        <w:t>Представитель лица, осуществляющего строительство, реконструкцию, капитальный ремонт</w:t>
+      </w:r>
+    </w:p>
+    <w:p>
+      <w:r>
+        <w:t>___________________________________________________________________________</w:t>
+      </w:r>
+    </w:p>
+    <w:p>
+      <w:r>
+        <w:rPr>
+          <w:sz w:val="18"/>
+        </w:rPr>
+        <w:t>(должность (при наличии), фамилия, инициалы, реквизиты распорядительного документа, подтверждающего полномочия)</w:t>
+      </w:r>
+    </w:p>
+    <w:p>
+      <w:pPr>
+        <w:keepNext/>
+      </w:pPr>
+      <w:r>
+        <w:t>Представитель лица, осуществляющего строительство, реконструкцию, капитальный ремонт, по вопросам строительного контроля</w:t>
+      </w:r>
+    </w:p>
+    <w:p>
+      <w:r>
+        <w:t>___________________________________________________________________________</w:t>
+      </w:r>
+    </w:p>
+    <w:p>
+      <w:r>
+        <w:rPr>
+          <w:sz w:val="18"/>
+        </w:rPr>
+        <w:t>(должность (при наличии), фамилия, инициалы, идентификационный номер в национальном реестре специалистов в области строительства (за исключением случаев, когда членство в саморегулируемых организациях в области строительства, реконструкции, капитального ремонта объектов капитального строительства не требуется),</w:t>
+      </w:r>
+    </w:p>
+    <w:p>
+      <w:r>
+        <w:t>___________________________________________________________________________</w:t>
+      </w:r>
+    </w:p>
+    <w:p>
+      <w:r>
+        <w:t>реквизиты распорядительного документа, подтверждающего полномочия)</w:t>
+      </w:r>
+    </w:p>
+    <w:p>
+      <w:pPr>
+        <w:keepNext/>
+      </w:pPr>
+      <w:r>
+        <w:t>Представитель лица, осуществляющего подготовку проектной документации (в случае привлечения застройщиком лица, осуществляющего подготовку проектной документации, для проверки соответствия выполняемых работ проектной документации согласно части 2 статьи 53 Градостроительного кодекса Российской Федерации)</w:t>
+      </w:r>
+    </w:p>
+    <w:p>
+      <w:r>
+        <w:t>___________________________________________________________________________</w:t>
+      </w:r>
+    </w:p>
+    <w:p>
+      <w:r>
+        <w:rPr>
+          <w:sz w:val="18"/>
+        </w:rPr>
+        <w:t>(должность (при наличии), фамилия, инициалы, реквизиты распорядительного документа, подтверждающего полномочия,</w:t>
+      </w:r>
+    </w:p>
+    <w:p>
+      <w:r>
+        <w:t>___________________________________________________________________________</w:t>
+      </w:r>
+    </w:p>
+    <w:p>
+      <w:r>
+        <w:t>с указанием полного и (или) сокращенного наименования, ОГРН, ИНН, адреса юридического лица в пределах его места нахождения,</w:t>
+      </w:r>
+    </w:p>
+    <w:p>
+      <w:r>
+        <w:t>___________________________________________________________________________</w:t>
+      </w:r>
+    </w:p>
+    <w:p>
+      <w:r>
+        <w:t>фамилии, имени, отчества (последнее - при наличии), адреса места жительства, ОГРНИП, ИНН индивидуального предпринимателя)</w:t>
+      </w:r>
+    </w:p>
+    <w:p>
+      <w:pPr>
+        <w:keepNext/>
+      </w:pPr>
+      <w:r>
+        <w:t>Представитель лица, выполнившего работы, подлежащие освидетельствованию (в случае выполнения работ по договорам о строительстве, реконструкции, капитальном ремонте объектов капитального строительства, заключенным с иными лицами)</w:t>
+      </w:r>
+    </w:p>
+    <w:p>
+      <w:r>
+        <w:t>___________________________________________________________________________</w:t>
+      </w:r>
+    </w:p>
+    <w:p>
+      <w:r>
+        <w:rPr>
+          <w:sz w:val="18"/>
+        </w:rPr>
+        <w:t>(должность (при наличии), фамилия, инициалы, реквизиты распорядительного документа, подтверждающего полномочия,</w:t>
+      </w:r>
+    </w:p>
+    <w:p>
+      <w:r>
+        <w:t>___________________________________________________________________________</w:t>
+      </w:r>
+    </w:p>
+    <w:p>
+      <w:r>
+        <w:t>с указанием полного и (или) сокращенного наименования, ОГРН, ИНН, адреса юридического лица в пределах его места нахождения,</w:t>
+      </w:r>
+    </w:p>
+    <w:p>
+      <w:r>
+        <w:t>___________________________________________________________________________</w:t>
+      </w:r>
+    </w:p>
+    <w:p>
+      <w:r>
+        <w:t>фамилии, имени, отчества (последнее - при наличии), адреса места жительства, ОГРНИП, ИНН индивидуального предпринимателя)</w:t>
+      </w:r>
+    </w:p>
+    <w:p>
+      <w:pPr>
+        <w:keepNext/>
+      </w:pPr>
+      <w:r>
+        <w:t>произвели осмотр работ, выполненных</w:t>
+      </w:r>
+    </w:p>
+    <w:p>
+      <w:r>
+        <w:t>__________________________________________________________________________,</w:t>
+      </w:r>
+    </w:p>
+    <w:p>
+      <w:r>
+        <w:rPr>
+          <w:sz w:val="18"/>
+        </w:rPr>
+        <w:t>(полное и (или) сокращенное наименование или фамилия, имя, отчество (последнее - при наличии) лица, выполнившего работы, подлежащие освидетельствованию)</w:t>
+      </w:r>
+    </w:p>
+    <w:p>
+      <w:pPr>
+        <w:keepNext/>
+      </w:pPr>
+      <w:r>
+        <w:t>и составили настоящий акт о нижеследующем:</w:t>
+      </w:r>
+    </w:p>
+    <w:p>
+      <w:pPr>
+        <w:keepNext/>
+      </w:pPr>
+      <w:r>
+        <w:rPr>
+          <w:b/>
+        </w:rPr>
+        <w:t>1. К освидетельствованию предъявлены следующие работы:</w:t>
+      </w:r>
+    </w:p>
+    <w:p>
+      <w:r>
+        <w:t>___________________________________________________________________________</w:t>
+      </w:r>
+    </w:p>
+    <w:p>
+      <w:r>
+        <w:rPr>
+          <w:sz w:val="18"/>
+        </w:rPr>
+        <w:t>(наименование скрытых работ)</w:t>
+      </w:r>
+    </w:p>
+    <w:p>
+      <w:pPr>
+        <w:keepNext/>
+      </w:pPr>
+      <w:r>
+        <w:rPr>
+          <w:b/>
+        </w:rPr>
+        <w:t>2. Работы выполнены по проектной документации</w:t>
+      </w:r>
+    </w:p>
+    <w:p>
+      <w:r>
+        <w:t>___________________________________________________________________________</w:t>
+      </w:r>
+    </w:p>
+    <w:p>
+      <w:r>
+        <w:rPr>
+          <w:sz w:val="18"/>
+        </w:rPr>
+        <w:t>(номер, другие реквизиты чертежа, наименование проектной и (или) рабочей</w:t>
+      </w:r>
+    </w:p>
+    <w:p>
+      <w:r>
+        <w:t>___________________________________________________________________________</w:t>
+      </w:r>
+    </w:p>
+    <w:p>
+      <w:r>
+        <w:t>документации, сведения о лицах, осуществляющих подготовку раздела проектной и (или) рабочей документации)</w:t>
+      </w:r>
+    </w:p>
+    <w:p>
+      <w:pPr>
+        <w:keepNext/>
+      </w:pPr>
+      <w:r>
+        <w:rPr>
+          <w:b/>
+        </w:rPr>
+        <w:t>3. При выполнении работ применены _________________________________________ (наименования строительных материалов</w:t>
+      </w:r>
+    </w:p>
+    <w:p>
+      <w:r>
+        <w:t>___________________________________________________________________________</w:t>
+      </w:r>
+    </w:p>
+    <w:p>
+      <w:r>
+        <w:rPr>
+          <w:sz w:val="18"/>
+        </w:rPr>
+        <w:t>(изделий), реквизиты сертификатов и (или) других документов, подтверждающих их качество и безопасность, в случае если необходимо указывать более 5 документов, указывается ссылка на их реестр, который является неотъемлемой частью акта)</w:t>
+      </w:r>
+    </w:p>
+    <w:p>
+      <w:pPr>
+        <w:keepNext/>
+      </w:pPr>
+      <w:r>
+        <w:rPr>
+          <w:b/>
+        </w:rPr>
+        <w:t>4. Предъявлены документы, подтверждающие соответствие работ предъявляемым к ним требованиям</w:t>
+      </w:r>
+    </w:p>
+    <w:p>
+      <w:r>
+        <w:t>___________________________________________________________________________</w:t>
+      </w:r>
+    </w:p>
+    <w:p>
+      <w:r>
+        <w:rPr>
+          <w:sz w:val="18"/>
+        </w:rPr>
+        <w:t>(исполнительные схемы и чертежи, результаты экспертиз, обследований,</w:t>
+      </w:r>
+    </w:p>
+    <w:p>
+      <w:r>
+        <w:t>___________________________________________________________________________</w:t>
+      </w:r>
+    </w:p>
+    <w:p>
+      <w:r>
+        <w:t>лабораторных и иных испытаний выполненных работ, проведенных в процессе строительного контроля)</w:t>
+      </w:r>
+    </w:p>
+    <w:p>
+      <w:pPr>
+        <w:keepNext/>
+      </w:pPr>
+      <w:r>
+        <w:rPr>
+          <w:b/>
+        </w:rPr>
+        <w:t>5. Даты: начала работ "__" ___________ 20__ г. окончания работ "__" ___________ 20__ г.</w:t>
+      </w:r>
+    </w:p>
+    <w:p>
+      <w:pPr>
+        <w:keepNext/>
+      </w:pPr>
+      <w:r>
+        <w:rPr>
+          <w:b/>
+        </w:rPr>
+        <w:t>6. Работы выполнены в соответствии с</w:t>
+      </w:r>
+    </w:p>
+    <w:p>
+      <w:r>
+        <w:t>___________________________________________________________________________</w:t>
+      </w:r>
+    </w:p>
+    <w:p>
+      <w:r>
+        <w:rPr>
+          <w:sz w:val="18"/>
+        </w:rPr>
+        <w:t>(наименования и структурные единицы технических регламентов,</w:t>
+      </w:r>
+    </w:p>
+    <w:p>
+      <w:r>
+        <w:t>___________________________________________________________________________</w:t>
+      </w:r>
+    </w:p>
+    <w:p>
+      <w:r>
+        <w:t>иных нормативных правовых актов, разделы проектной и (или) рабочей документации)</w:t>
+      </w:r>
+    </w:p>
+    <w:p>
+      <w:pPr>
+        <w:keepNext/>
+      </w:pPr>
+      <w:r>
+        <w:rPr>
+          <w:b/>
+        </w:rPr>
+        <w:t>7. Разрешается производство последующих работ</w:t>
+      </w:r>
+    </w:p>
+    <w:p>
+      <w:r>
+        <w:t>___________________________________________________________________________</w:t>
+      </w:r>
+    </w:p>
+    <w:p>
+      <w:r>
+        <w:rPr>
+          <w:sz w:val="18"/>
+        </w:rPr>
+        <w:t>(наименования работ, строительных конструкций, участков сетей инженерно-технического обеспечения)</w:t>
+      </w:r>
+    </w:p>
+    <w:p>
+      <w:pPr>
+        <w:keepNext/>
+      </w:pPr>
+      <w:r>
+        <w:t>Дополнительные сведения ___________________________________________________</w:t>
+      </w:r>
+    </w:p>
+    <w:p>
+      <w:pPr>
+        <w:keepNext/>
+      </w:pPr>
+      <w:r>
+        <w:t>Акт составлен в _________ экземплярах (в случае заполнения акта на бумажном носителе).</w:t>
+      </w:r>
+    </w:p>
+    <w:p>
+      <w:pPr>
+        <w:keepNext/>
+      </w:pPr>
+      <w:r>
+        <w:t>Приложения ________________________________________________________________ (исполнительные схемы и чертежи, результаты экспертиз, обследований, лабораторных и иных испытаний)</w:t>
+      </w:r>
+    </w:p>
+    <w:p>
+      <w:pPr>
+        <w:keepNext/>
+        <w:pageBreakBefore/>
+        <w:spacing w:after="140"/>
+      </w:pPr>
+      <w:r>
+        <w:t>Представитель застройщика, технического заказчика, лица, ответственного за эксплуатацию здания, сооружения, или регионального оператора по вопросам строительного контроля</w:t>
+      </w:r>
+    </w:p>
+    <w:p>
+      <w:pPr>
+        <w:keepNext/>
+        <w:spacing w:after="140"/>
+      </w:pPr>
+      <w:r>
+        <w:t>___________________________ ______________</w:t>
+      </w:r>
+    </w:p>
+    <w:p>
+      <w:pPr>
+        <w:spacing w:after="140"/>
+      </w:pPr>
+      <w:r>
+        <w:rPr>
+          <w:sz w:val="18"/>
+        </w:rPr>
+        <w:t>(фамилия, инициалы) (подпись)</w:t>
+      </w:r>
+    </w:p>
+    <w:p>
+      <w:pPr>
+        <w:keepNext/>
+        <w:spacing w:after="140"/>
+      </w:pPr>
+      <w:r>
+        <w:t>Представитель лица, осуществляющего строительство, реконструкцию, капитальный ремонт</w:t>
+      </w:r>
+    </w:p>
+    <w:p>
+      <w:pPr>
+        <w:keepNext/>
+        <w:spacing w:after="140"/>
+      </w:pPr>
+      <w:r>
+        <w:t>___________________________ ______________</w:t>
+      </w:r>
+    </w:p>
+    <w:p>
+      <w:pPr>
+        <w:spacing w:after="140"/>
+      </w:pPr>
+      <w:r>
+        <w:rPr>
+          <w:sz w:val="18"/>
+        </w:rPr>
+        <w:t>(фамилия, инициалы) (подпись)</w:t>
+      </w:r>
+    </w:p>
+    <w:p>
+      <w:pPr>
+        <w:keepNext/>
+        <w:spacing w:after="140"/>
+      </w:pPr>
+      <w:r>
+        <w:t>Представитель лица, осуществляющего строительство, реконструкцию, капитальный ремонт, по вопросам строительного контроля</w:t>
+      </w:r>
+    </w:p>
+    <w:p>
+      <w:pPr>
+        <w:keepNext/>
+        <w:spacing w:after="140"/>
+      </w:pPr>
+      <w:r>
+        <w:t>___________________________ ______________</w:t>
+      </w:r>
+    </w:p>
+    <w:p>
+      <w:pPr>
+        <w:spacing w:after="140"/>
+      </w:pPr>
+      <w:r>
+        <w:rPr>
+          <w:sz w:val="18"/>
+        </w:rPr>
+        <w:t>(фамилия, инициалы) (подпись)</w:t>
+      </w:r>
+    </w:p>
+    <w:p>
+      <w:pPr>
+        <w:keepNext/>
+        <w:spacing w:after="140"/>
+      </w:pPr>
+      <w:r>
+        <w:t>Представитель лица, осуществляющего подготовку проектной документации (в случае привлечения застройщиком лица, осуществляющего подготовку проектной документации, для проверки соответствия выполняемых работ проектной документации согласно части 2 статьи 53 Градостроительного кодекса Российской Федерации)</w:t>
+      </w:r>
+    </w:p>
+    <w:p>
+      <w:pPr>
+        <w:keepNext/>
+        <w:spacing w:after="140"/>
+      </w:pPr>
+      <w:r>
+        <w:t>___________________________ ______________</w:t>
+      </w:r>
+    </w:p>
+    <w:p>
+      <w:pPr>
+        <w:spacing w:after="140"/>
+      </w:pPr>
+      <w:r>
+        <w:rPr>
+          <w:sz w:val="18"/>
+        </w:rPr>
+        <w:t>(фамилия, инициалы) (подпись)</w:t>
+      </w:r>
+    </w:p>
+    <w:p>
+      <w:pPr>
+        <w:keepNext/>
+        <w:spacing w:after="140"/>
+      </w:pPr>
+      <w:r>
+        <w:t>Представитель лица, выполнившего работы, подлежащие освидетельствованию (в случае выполнения работ по договорам о строительстве, реконструкции, капитальном ремонте объектов капитального строительства, заключенным с иными лицами)</w:t>
+      </w:r>
+    </w:p>
+    <w:p>
+      <w:pPr>
+        <w:keepNext/>
+        <w:spacing w:after="140"/>
+      </w:pPr>
+      <w:r>
+        <w:t>___________________________ ______________</w:t>
+      </w:r>
+    </w:p>
+    <w:p>
+      <w:pPr>
+        <w:spacing w:after="140"/>
+      </w:pPr>
+      <w:r>
+        <w:rPr>
+          <w:sz w:val="18"/>
+        </w:rPr>
+        <w:t>(фамилия, инициалы) (подпись)</w:t>
+      </w:r>
+    </w:p>
+    <w:p>
+      <w:r>
+        <w:br w:type="page"/>
+      </w:r>
+    </w:p>
+    <w:p>
+      <w:pPr>
+        <w:pStyle w:val="Title"/>
+      </w:pPr>
+      <w:r>
+        <w:t>Вариант 3 Электромонтажные работы до закрытия</w:t>
+      </w:r>
+    </w:p>
+    <w:p>
+      <w:r>
+        <w:rPr>
+          <w:color w:val="8E6F32"/>
+          <w:sz w:val="18"/>
+        </w:rPr>
+        <w:t>Рекомендуемый образец приложения № 3 к составу исполнительной документации, утверждённому приказом Минстроя России от 16.05.2023 № 344/пр.</w:t>
+      </w:r>
+    </w:p>
+    <w:p>
+      <w:pPr>
+        <w:spacing w:after="160"/>
+      </w:pPr>
+      <w:r>
+        <w:t>Укажите фактические работы, место и проектные решения в пунктах 1 и 2. Материалы и результаты контроля внесите в пункты 3 и 4. Подписи оформите по составу участников освидетельствования, указанному в форме.</w:t>
+      </w:r>
+    </w:p>
+    <w:p>
+      <w:r>
+        <w:t>Укажите трассу, помещение, марки и сечения кабелей, способ прокладки и крепления; приложите исполнительную схему и результаты предусмотренных испытаний.</w:t>
+      </w:r>
+    </w:p>
+    <w:p>
+      <w:pPr>
+        <w:keepNext/>
+      </w:pPr>
+      <w:r>
+        <w:t>Объект капитального строительства</w:t>
+      </w:r>
+    </w:p>
+    <w:p>
+      <w:r>
+        <w:t>___________________________________________________________________________</w:t>
+      </w:r>
+    </w:p>
+    <w:p>
+      <w:r>
+        <w:rPr>
+          <w:sz w:val="18"/>
+        </w:rPr>
+        <w:t>(наименование объекта капитального строительства в соответствии с проектной документацией, почтовый или строительный адрес объекта капитального строительства)</w:t>
+      </w:r>
+    </w:p>
+    <w:p>
+      <w:pPr>
+        <w:keepNext/>
+      </w:pPr>
+      <w:r>
+        <w:t>Застройщик, технический заказчик, лицо, ответственное за эксплуатацию здания, сооружения, или региональный оператор</w:t>
+      </w:r>
+    </w:p>
+    <w:p>
+      <w:r>
+        <w:t>___________________________________________________________________________</w:t>
+      </w:r>
+    </w:p>
+    <w:p>
+      <w:r>
+        <w:rPr>
+          <w:sz w:val="18"/>
+        </w:rPr>
+        <w:t>(фамилия, имя, отчество (последнее - при наличии), адрес места жительства, ОГРНИП, ИНН индивидуального предпринимателя,</w:t>
+      </w:r>
+    </w:p>
+    <w:p>
+      <w:r>
+        <w:t>___________________________________________________________________________</w:t>
+      </w:r>
+    </w:p>
+    <w:p>
+      <w:r>
+        <w:t>полное и (или) сокращенное наименование, ОГРН, ИНН, адрес юридического лица в пределах его места нахождения, телефон или факс,</w:t>
+      </w:r>
+    </w:p>
+    <w:p>
+      <w:r>
+        <w:t>___________________________________________________________________________</w:t>
+      </w:r>
+    </w:p>
+    <w:p>
+      <w:r>
+        <w:t>полное и (или) сокращенное наименование, ОГРН, ИНН саморегулируемой организации, членом которой является указанное юридическое лицо или индивидуальный предприниматель (за исключением случаев, когда членство в саморегулируемых организациях в области строительства, реконструкции, капитального ремонта объектов капитального строительства не требуется);</w:t>
+      </w:r>
+    </w:p>
+    <w:p>
+      <w:r>
+        <w:t>___________________________________________________________________________</w:t>
+      </w:r>
+    </w:p>
+    <w:p>
+      <w:r>
+        <w:t>фамилия, имя, отчество (последнее - при наличии), паспортные данные, адрес места жительства, телефон или факс - для физических лиц, не являющихся индивидуальными предпринимателями)</w:t>
+      </w:r>
+    </w:p>
+    <w:p>
+      <w:pPr>
+        <w:keepNext/>
+      </w:pPr>
+      <w:r>
+        <w:t>Лицо, осуществляющее строительство, реконструкцию, капитальный ремонт</w:t>
+      </w:r>
+    </w:p>
+    <w:p>
+      <w:r>
+        <w:t>___________________________________________________________________________</w:t>
+      </w:r>
+    </w:p>
+    <w:p>
+      <w:r>
+        <w:rPr>
+          <w:sz w:val="18"/>
+        </w:rPr>
+        <w:t>(фамилия, имя, отчество (последнее - при наличии), адрес места жительства, ОГРНИП, ИНН индивидуального предпринимателя,</w:t>
+      </w:r>
+    </w:p>
+    <w:p>
+      <w:r>
+        <w:t>___________________________________________________________________________</w:t>
+      </w:r>
+    </w:p>
+    <w:p>
+      <w:r>
+        <w:t>полное и (или) сокращенное наименование, ОГРН, ИНН, адрес юридического лица в пределах его места нахождения, телефон или факс,</w:t>
+      </w:r>
+    </w:p>
+    <w:p>
+      <w:r>
+        <w:t>___________________________________________________________________________</w:t>
+      </w:r>
+    </w:p>
+    <w:p>
+      <w:r>
+        <w:t>полное и (или) сокращенное наименование, ОГРН, ИНН саморегулируемой организации, членом которой является указанное юридическое лицо или индивидуальный предприниматель (за исключением случаев, когда членство в саморегулируемых организациях в области строительства, реконструкции, капитального ремонта объектов капитального строительства не требуется)</w:t>
+      </w:r>
+    </w:p>
+    <w:p>
+      <w:pPr>
+        <w:keepNext/>
+      </w:pPr>
+      <w:r>
+        <w:t>Лицо, осуществляющее подготовку проектной документации</w:t>
+      </w:r>
+    </w:p>
+    <w:p>
+      <w:r>
+        <w:t>___________________________________________________________________________</w:t>
+      </w:r>
+    </w:p>
+    <w:p>
+      <w:r>
+        <w:rPr>
+          <w:sz w:val="18"/>
+        </w:rPr>
+        <w:t>(фамилия, имя, отчество (последнее - при наличии), адрес места жительства, ОГРНИП, ИНН индивидуального предпринимателя,</w:t>
+      </w:r>
+    </w:p>
+    <w:p>
+      <w:r>
+        <w:t>___________________________________________________________________________</w:t>
+      </w:r>
+    </w:p>
+    <w:p>
+      <w:r>
+        <w:t>полное и (или) сокращенное наименование, ОГРН, ИНН, адрес юридического лица в пределах его места нахождения, телефон или факс,</w:t>
+      </w:r>
+    </w:p>
+    <w:p>
+      <w:r>
+        <w:t>___________________________________________________________________________</w:t>
+      </w:r>
+    </w:p>
+    <w:p>
+      <w:r>
+        <w:t>полное и (или) сокращенное наименование, ОГРН, ИНН саморегулируемой организации, членом которой является указанное юридическое лицо или индивидуальный предприниматель (за исключением случаев, когда членство в саморегулируемых организациях в области архитектурно-строительного проектирования не требуется)</w:t>
+      </w:r>
+    </w:p>
+    <w:p>
+      <w:pPr>
+        <w:keepNext/>
+        <w:jc w:val="center"/>
+      </w:pPr>
+      <w:r>
+        <w:rPr>
+          <w:b/>
+          <w:sz w:val="24"/>
+        </w:rPr>
+        <w:t>АКТ</w:t>
+      </w:r>
+    </w:p>
+    <w:p>
+      <w:pPr>
+        <w:keepNext/>
+        <w:jc w:val="center"/>
+      </w:pPr>
+      <w:r>
+        <w:rPr>
+          <w:b/>
+          <w:sz w:val="24"/>
+        </w:rPr>
+        <w:t>освидетельствования скрытых работ</w:t>
+      </w:r>
+    </w:p>
+    <w:p>
+      <w:pPr>
+        <w:keepNext/>
+      </w:pPr>
+      <w:r>
+        <w:t>N __________ "__" _____________ 20__ г. (дата составления акта)</w:t>
+      </w:r>
+    </w:p>
+    <w:p>
+      <w:pPr>
+        <w:keepNext/>
+      </w:pPr>
+      <w:r>
+        <w:t>Представитель застройщика, технического заказчика, лица, ответственного за эксплуатацию здания, сооружения, или регионального оператора по вопросам строительного контроля</w:t>
+      </w:r>
+    </w:p>
+    <w:p>
+      <w:r>
+        <w:t>___________________________________________________________________________</w:t>
+      </w:r>
+    </w:p>
+    <w:p>
+      <w:r>
+        <w:rPr>
+          <w:sz w:val="18"/>
+        </w:rPr>
+        <w:t>(должность (при наличии), фамилия, инициалы, идентификационный номер в национальном реестре специалистов в области строительства (за исключением случаев, когда членство в саморегулируемых организациях в области строительства, реконструкции, капитального ремонта объектов капитального строительства не требуется),</w:t>
+      </w:r>
+    </w:p>
+    <w:p>
+      <w:r>
+        <w:t>___________________________________________________________________________</w:t>
+      </w:r>
+    </w:p>
+    <w:p>
+      <w:r>
+        <w:t>реквизиты распорядительного документа, подтверждающего полномочия,</w:t>
+      </w:r>
+    </w:p>
+    <w:p>
+      <w:r>
+        <w:t>___________________________________________________________________________</w:t>
+      </w:r>
+    </w:p>
+    <w:p>
+      <w:r>
+        <w:t>с указанием полного и (или) сокращенного наименования, ОГРН, ИНН, адреса юридического лица в пределах его места нахождения (в случае осуществления строительного контроля на основании договора с застройщиком или техническим заказчиком),</w:t>
+      </w:r>
+    </w:p>
+    <w:p>
+      <w:r>
+        <w:t>___________________________________________________________________________</w:t>
+      </w:r>
+    </w:p>
+    <w:p>
+      <w:r>
+        <w:t>фамилии, имени, отчества (последнее - при наличии), адреса места жительства, ОГРНИП, ИНН индивидуального предпринимателя (в случае осуществления строительного контроля на основании договора с застройщиком или техническим заказчиком)</w:t>
+      </w:r>
+    </w:p>
+    <w:p>
+      <w:pPr>
+        <w:keepNext/>
+      </w:pPr>
+      <w:r>
+        <w:t>Представитель лица, осуществляющего строительство, реконструкцию, капитальный ремонт</w:t>
+      </w:r>
+    </w:p>
+    <w:p>
+      <w:r>
+        <w:t>___________________________________________________________________________</w:t>
+      </w:r>
+    </w:p>
+    <w:p>
+      <w:r>
+        <w:rPr>
+          <w:sz w:val="18"/>
+        </w:rPr>
+        <w:t>(должность (при наличии), фамилия, инициалы, реквизиты распорядительного документа, подтверждающего полномочия)</w:t>
+      </w:r>
+    </w:p>
+    <w:p>
+      <w:pPr>
+        <w:keepNext/>
+      </w:pPr>
+      <w:r>
+        <w:t>Представитель лица, осуществляющего строительство, реконструкцию, капитальный ремонт, по вопросам строительного контроля</w:t>
+      </w:r>
+    </w:p>
+    <w:p>
+      <w:r>
+        <w:t>___________________________________________________________________________</w:t>
+      </w:r>
+    </w:p>
+    <w:p>
+      <w:r>
+        <w:rPr>
+          <w:sz w:val="18"/>
+        </w:rPr>
+        <w:t>(должность (при наличии), фамилия, инициалы, идентификационный номер в национальном реестре специалистов в области строительства (за исключением случаев, когда членство в саморегулируемых организациях в области строительства, реконструкции, капитального ремонта объектов капитального строительства не требуется),</w:t>
+      </w:r>
+    </w:p>
+    <w:p>
+      <w:r>
+        <w:t>___________________________________________________________________________</w:t>
+      </w:r>
+    </w:p>
+    <w:p>
+      <w:r>
+        <w:t>реквизиты распорядительного документа, подтверждающего полномочия)</w:t>
+      </w:r>
+    </w:p>
+    <w:p>
+      <w:pPr>
+        <w:keepNext/>
+      </w:pPr>
+      <w:r>
+        <w:t>Представитель лица, осуществляющего подготовку проектной документации (в случае привлечения застройщиком лица, осуществляющего подготовку проектной документации, для проверки соответствия выполняемых работ проектной документации согласно части 2 статьи 53 Градостроительного кодекса Российской Федерации)</w:t>
+      </w:r>
+    </w:p>
+    <w:p>
+      <w:r>
+        <w:t>___________________________________________________________________________</w:t>
+      </w:r>
+    </w:p>
+    <w:p>
+      <w:r>
+        <w:rPr>
+          <w:sz w:val="18"/>
+        </w:rPr>
+        <w:t>(должность (при наличии), фамилия, инициалы, реквизиты распорядительного документа, подтверждающего полномочия,</w:t>
+      </w:r>
+    </w:p>
+    <w:p>
+      <w:r>
+        <w:t>___________________________________________________________________________</w:t>
+      </w:r>
+    </w:p>
+    <w:p>
+      <w:r>
+        <w:t>с указанием полного и (или) сокращенного наименования, ОГРН, ИНН, адреса юридического лица в пределах его места нахождения,</w:t>
+      </w:r>
+    </w:p>
+    <w:p>
+      <w:r>
+        <w:t>___________________________________________________________________________</w:t>
+      </w:r>
+    </w:p>
+    <w:p>
+      <w:r>
+        <w:t>фамилии, имени, отчества (последнее - при наличии), адреса места жительства, ОГРНИП, ИНН индивидуального предпринимателя)</w:t>
+      </w:r>
+    </w:p>
+    <w:p>
+      <w:pPr>
+        <w:keepNext/>
+      </w:pPr>
+      <w:r>
+        <w:t>Представитель лица, выполнившего работы, подлежащие освидетельствованию (в случае выполнения работ по договорам о строительстве, реконструкции, капитальном ремонте объектов капитального строительства, заключенным с иными лицами)</w:t>
+      </w:r>
+    </w:p>
+    <w:p>
+      <w:r>
+        <w:t>___________________________________________________________________________</w:t>
+      </w:r>
+    </w:p>
+    <w:p>
+      <w:r>
+        <w:rPr>
+          <w:sz w:val="18"/>
+        </w:rPr>
+        <w:t>(должность (при наличии), фамилия, инициалы, реквизиты распорядительного документа, подтверждающего полномочия,</w:t>
+      </w:r>
+    </w:p>
+    <w:p>
+      <w:r>
+        <w:t>___________________________________________________________________________</w:t>
+      </w:r>
+    </w:p>
+    <w:p>
+      <w:r>
+        <w:t>с указанием полного и (или) сокращенного наименования, ОГРН, ИНН, адреса юридического лица в пределах его места нахождения,</w:t>
+      </w:r>
+    </w:p>
+    <w:p>
+      <w:r>
+        <w:t>___________________________________________________________________________</w:t>
+      </w:r>
+    </w:p>
+    <w:p>
+      <w:r>
+        <w:t>фамилии, имени, отчества (последнее - при наличии), адреса места жительства, ОГРНИП, ИНН индивидуального предпринимателя)</w:t>
+      </w:r>
+    </w:p>
+    <w:p>
+      <w:pPr>
+        <w:keepNext/>
+      </w:pPr>
+      <w:r>
+        <w:t>произвели осмотр работ, выполненных</w:t>
+      </w:r>
+    </w:p>
+    <w:p>
+      <w:r>
+        <w:t>__________________________________________________________________________,</w:t>
+      </w:r>
+    </w:p>
+    <w:p>
+      <w:r>
+        <w:rPr>
+          <w:sz w:val="18"/>
+        </w:rPr>
+        <w:t>(полное и (или) сокращенное наименование или фамилия, имя, отчество (последнее - при наличии) лица, выполнившего работы, подлежащие освидетельствованию)</w:t>
+      </w:r>
+    </w:p>
+    <w:p>
+      <w:pPr>
+        <w:keepNext/>
+      </w:pPr>
+      <w:r>
+        <w:t>и составили настоящий акт о нижеследующем:</w:t>
+      </w:r>
+    </w:p>
+    <w:p>
+      <w:pPr>
+        <w:keepNext/>
+      </w:pPr>
+      <w:r>
+        <w:rPr>
+          <w:b/>
+        </w:rPr>
+        <w:t>1. К освидетельствованию предъявлены следующие работы:</w:t>
+      </w:r>
+    </w:p>
+    <w:p>
+      <w:r>
+        <w:t>___________________________________________________________________________</w:t>
+      </w:r>
+    </w:p>
+    <w:p>
+      <w:r>
+        <w:rPr>
+          <w:sz w:val="18"/>
+        </w:rPr>
+        <w:t>(наименование скрытых работ)</w:t>
+      </w:r>
+    </w:p>
+    <w:p>
+      <w:pPr>
+        <w:keepNext/>
+      </w:pPr>
+      <w:r>
+        <w:rPr>
+          <w:b/>
+        </w:rPr>
+        <w:t>2. Работы выполнены по проектной документации</w:t>
+      </w:r>
+    </w:p>
+    <w:p>
+      <w:r>
+        <w:t>___________________________________________________________________________</w:t>
+      </w:r>
+    </w:p>
+    <w:p>
+      <w:r>
+        <w:rPr>
+          <w:sz w:val="18"/>
+        </w:rPr>
+        <w:t>(номер, другие реквизиты чертежа, наименование проектной и (или) рабочей</w:t>
+      </w:r>
+    </w:p>
+    <w:p>
+      <w:r>
+        <w:t>___________________________________________________________________________</w:t>
+      </w:r>
+    </w:p>
+    <w:p>
+      <w:r>
+        <w:t>документации, сведения о лицах, осуществляющих подготовку раздела проектной и (или) рабочей документации)</w:t>
+      </w:r>
+    </w:p>
+    <w:p>
+      <w:pPr>
+        <w:keepNext/>
+      </w:pPr>
+      <w:r>
+        <w:rPr>
+          <w:b/>
+        </w:rPr>
+        <w:t>3. При выполнении работ применены _________________________________________ (наименования строительных материалов</w:t>
+      </w:r>
+    </w:p>
+    <w:p>
+      <w:r>
+        <w:t>___________________________________________________________________________</w:t>
+      </w:r>
+    </w:p>
+    <w:p>
+      <w:r>
+        <w:rPr>
+          <w:sz w:val="18"/>
+        </w:rPr>
+        <w:t>(изделий), реквизиты сертификатов и (или) других документов, подтверждающих их качество и безопасность, в случае если необходимо указывать более 5 документов, указывается ссылка на их реестр, который является неотъемлемой частью акта)</w:t>
+      </w:r>
+    </w:p>
+    <w:p>
+      <w:pPr>
+        <w:keepNext/>
+      </w:pPr>
+      <w:r>
+        <w:rPr>
+          <w:b/>
+        </w:rPr>
+        <w:t>4. Предъявлены документы, подтверждающие соответствие работ предъявляемым к ним требованиям</w:t>
+      </w:r>
+    </w:p>
+    <w:p>
+      <w:r>
+        <w:t>___________________________________________________________________________</w:t>
+      </w:r>
+    </w:p>
+    <w:p>
+      <w:r>
+        <w:rPr>
+          <w:sz w:val="18"/>
+        </w:rPr>
+        <w:t>(исполнительные схемы и чертежи, результаты экспертиз, обследований,</w:t>
+      </w:r>
+    </w:p>
+    <w:p>
+      <w:r>
+        <w:t>___________________________________________________________________________</w:t>
+      </w:r>
+    </w:p>
+    <w:p>
+      <w:r>
+        <w:t>лабораторных и иных испытаний выполненных работ, проведенных в процессе строительного контроля)</w:t>
+      </w:r>
+    </w:p>
+    <w:p>
+      <w:pPr>
+        <w:keepNext/>
+      </w:pPr>
+      <w:r>
+        <w:rPr>
+          <w:b/>
+        </w:rPr>
+        <w:t>5. Даты: начала работ "__" ___________ 20__ г. окончания работ "__" ___________ 20__ г.</w:t>
+      </w:r>
+    </w:p>
+    <w:p>
+      <w:pPr>
+        <w:keepNext/>
+      </w:pPr>
+      <w:r>
+        <w:rPr>
+          <w:b/>
+        </w:rPr>
+        <w:t>6. Работы выполнены в соответствии с</w:t>
+      </w:r>
+    </w:p>
+    <w:p>
+      <w:r>
+        <w:t>___________________________________________________________________________</w:t>
+      </w:r>
+    </w:p>
+    <w:p>
+      <w:r>
+        <w:rPr>
+          <w:sz w:val="18"/>
+        </w:rPr>
+        <w:t>(наименования и структурные единицы технических регламентов,</w:t>
+      </w:r>
+    </w:p>
+    <w:p>
+      <w:r>
+        <w:t>___________________________________________________________________________</w:t>
+      </w:r>
+    </w:p>
+    <w:p>
+      <w:r>
+        <w:t>иных нормативных правовых актов, разделы проектной и (или) рабочей документации)</w:t>
+      </w:r>
+    </w:p>
+    <w:p>
+      <w:pPr>
+        <w:keepNext/>
+      </w:pPr>
+      <w:r>
+        <w:rPr>
+          <w:b/>
+        </w:rPr>
+        <w:t>7. Разрешается производство последующих работ</w:t>
+      </w:r>
+    </w:p>
+    <w:p>
+      <w:r>
+        <w:t>___________________________________________________________________________</w:t>
+      </w:r>
+    </w:p>
+    <w:p>
+      <w:r>
+        <w:rPr>
+          <w:sz w:val="18"/>
+        </w:rPr>
+        <w:t>(наименования работ, строительных конструкций, участков сетей инженерно-технического обеспечения)</w:t>
+      </w:r>
+    </w:p>
+    <w:p>
+      <w:pPr>
+        <w:keepNext/>
+      </w:pPr>
+      <w:r>
+        <w:t>Дополнительные сведения ___________________________________________________</w:t>
+      </w:r>
+    </w:p>
+    <w:p>
+      <w:pPr>
+        <w:keepNext/>
+      </w:pPr>
+      <w:r>
+        <w:t>Акт составлен в _________ экземплярах (в случае заполнения акта на бумажном носителе).</w:t>
+      </w:r>
+    </w:p>
+    <w:p>
+      <w:pPr>
+        <w:keepNext/>
+      </w:pPr>
+      <w:r>
+        <w:t>Приложения ________________________________________________________________ (исполнительные схемы и чертежи, результаты экспертиз, обследований, лабораторных и иных испытаний)</w:t>
+      </w:r>
+    </w:p>
+    <w:p>
+      <w:pPr>
+        <w:keepNext/>
+        <w:pageBreakBefore/>
+        <w:spacing w:after="140"/>
+      </w:pPr>
+      <w:r>
+        <w:t>Представитель застройщика, технического заказчика, лица, ответственного за эксплуатацию здания, сооружения, или регионального оператора по вопросам строительного контроля</w:t>
+      </w:r>
+    </w:p>
+    <w:p>
+      <w:pPr>
+        <w:keepNext/>
+        <w:spacing w:after="140"/>
+      </w:pPr>
+      <w:r>
+        <w:t>___________________________ ______________</w:t>
+      </w:r>
+    </w:p>
+    <w:p>
+      <w:pPr>
+        <w:spacing w:after="140"/>
+      </w:pPr>
+      <w:r>
+        <w:rPr>
+          <w:sz w:val="18"/>
+        </w:rPr>
+        <w:t>(фамилия, инициалы) (подпись)</w:t>
+      </w:r>
+    </w:p>
+    <w:p>
+      <w:pPr>
+        <w:keepNext/>
+        <w:spacing w:after="140"/>
+      </w:pPr>
+      <w:r>
+        <w:t>Представитель лица, осуществляющего строительство, реконструкцию, капитальный ремонт</w:t>
+      </w:r>
+    </w:p>
+    <w:p>
+      <w:pPr>
+        <w:keepNext/>
+        <w:spacing w:after="140"/>
+      </w:pPr>
+      <w:r>
+        <w:t>___________________________ ______________</w:t>
+      </w:r>
+    </w:p>
+    <w:p>
+      <w:pPr>
+        <w:spacing w:after="140"/>
+      </w:pPr>
+      <w:r>
+        <w:rPr>
+          <w:sz w:val="18"/>
+        </w:rPr>
+        <w:t>(фамилия, инициалы) (подпись)</w:t>
+      </w:r>
+    </w:p>
+    <w:p>
+      <w:pPr>
+        <w:keepNext/>
+        <w:spacing w:after="140"/>
+      </w:pPr>
+      <w:r>
+        <w:t>Представитель лица, осуществляющего строительство, реконструкцию, капитальный ремонт, по вопросам строительного контроля</w:t>
+      </w:r>
+    </w:p>
+    <w:p>
+      <w:pPr>
+        <w:keepNext/>
+        <w:spacing w:after="140"/>
+      </w:pPr>
+      <w:r>
+        <w:t>___________________________ ______________</w:t>
+      </w:r>
+    </w:p>
+    <w:p>
+      <w:pPr>
+        <w:spacing w:after="140"/>
+      </w:pPr>
+      <w:r>
+        <w:rPr>
+          <w:sz w:val="18"/>
+        </w:rPr>
+        <w:t>(фамилия, инициалы) (подпись)</w:t>
+      </w:r>
+    </w:p>
+    <w:p>
+      <w:pPr>
+        <w:keepNext/>
+        <w:spacing w:after="140"/>
+      </w:pPr>
+      <w:r>
+        <w:t>Представитель лица, осуществляющего подготовку проектной документации (в случае привлечения застройщиком лица, осуществляющего подготовку проектной документации, для проверки соответствия выполняемых работ проектной документации согласно части 2 статьи 53 Градостроительного кодекса Российской Федерации)</w:t>
+      </w:r>
+    </w:p>
+    <w:p>
+      <w:pPr>
+        <w:keepNext/>
+        <w:spacing w:after="140"/>
+      </w:pPr>
+      <w:r>
+        <w:t>___________________________ ______________</w:t>
+      </w:r>
+    </w:p>
+    <w:p>
+      <w:pPr>
+        <w:spacing w:after="140"/>
+      </w:pPr>
+      <w:r>
+        <w:rPr>
+          <w:sz w:val="18"/>
+        </w:rPr>
+        <w:t>(фамилия, инициалы) (подпись)</w:t>
+      </w:r>
+    </w:p>
+    <w:p>
+      <w:pPr>
+        <w:keepNext/>
+        <w:spacing w:after="140"/>
+      </w:pPr>
+      <w:r>
+        <w:t>Представитель лица, выполнившего работы, подлежащие освидетельствованию (в случае выполнения работ по договорам о строительстве, реконструкции, капитальном ремонте объектов капитального строительства, заключенным с иными лицами)</w:t>
+      </w:r>
+    </w:p>
+    <w:p>
+      <w:pPr>
+        <w:keepNext/>
+        <w:spacing w:after="140"/>
+      </w:pPr>
+      <w:r>
+        <w:t>___________________________ ______________</w:t>
+      </w:r>
+    </w:p>
+    <w:p>
+      <w:pPr>
+        <w:spacing w:after="140"/>
+      </w:pPr>
+      <w:r>
+        <w:rPr>
+          <w:sz w:val="18"/>
+        </w:rPr>
+        <w:t>(фамилия, инициалы) (подпись)</w:t>
+      </w:r>
+    </w:p>
+    <w:p>
+      <w:r>
+        <w:br w:type="page"/>
+      </w:r>
+    </w:p>
+    <w:p>
+      <w:pPr>
+        <w:pStyle w:val="Title"/>
+      </w:pPr>
+      <w:r>
+        <w:t>Вариант 4 Трубопроводы до закрытия</w:t>
+      </w:r>
+    </w:p>
+    <w:p>
+      <w:r>
+        <w:rPr>
+          <w:color w:val="8E6F32"/>
+          <w:sz w:val="18"/>
+        </w:rPr>
+        <w:t>Рекомендуемый образец приложения № 3 к составу исполнительной документации, утверждённому приказом Минстроя России от 16.05.2023 № 344/пр.</w:t>
+      </w:r>
+    </w:p>
+    <w:p>
+      <w:pPr>
+        <w:spacing w:after="160"/>
+      </w:pPr>
+      <w:r>
+        <w:t>Укажите фактические работы, место и проектные решения в пунктах 1 и 2. Материалы и результаты контроля внесите в пункты 3 и 4. Подписи оформите по составу участников освидетельствования, указанному в форме.</w:t>
+      </w:r>
+    </w:p>
+    <w:p>
+      <w:r>
+        <w:t>Укажите участок и назначение трубопровода, материалы, диаметры, соединения и проектные отметки; назовите документы о проведённых испытаниях, если они требуются для этих работ.</w:t>
+      </w:r>
+    </w:p>
+    <w:p>
+      <w:pPr>
+        <w:keepNext/>
+      </w:pPr>
+      <w:r>
+        <w:t>Объект капитального строительства</w:t>
+      </w:r>
+    </w:p>
+    <w:p>
+      <w:r>
+        <w:t>___________________________________________________________________________</w:t>
+      </w:r>
+    </w:p>
+    <w:p>
+      <w:r>
+        <w:rPr>
+          <w:sz w:val="18"/>
+        </w:rPr>
+        <w:t>(наименование объекта капитального строительства в соответствии с проектной документацией, почтовый или строительный адрес объекта капитального строительства)</w:t>
+      </w:r>
+    </w:p>
+    <w:p>
+      <w:pPr>
+        <w:keepNext/>
+      </w:pPr>
+      <w:r>
+        <w:t>Застройщик, технический заказчик, лицо, ответственное за эксплуатацию здания, сооружения, или региональный оператор</w:t>
+      </w:r>
+    </w:p>
+    <w:p>
+      <w:r>
+        <w:t>___________________________________________________________________________</w:t>
+      </w:r>
+    </w:p>
+    <w:p>
+      <w:r>
+        <w:rPr>
+          <w:sz w:val="18"/>
+        </w:rPr>
+        <w:t>(фамилия, имя, отчество (последнее - при наличии), адрес места жительства, ОГРНИП, ИНН индивидуального предпринимателя,</w:t>
+      </w:r>
+    </w:p>
+    <w:p>
+      <w:r>
+        <w:t>___________________________________________________________________________</w:t>
+      </w:r>
+    </w:p>
+    <w:p>
+      <w:r>
+        <w:t>полное и (или) сокращенное наименование, ОГРН, ИНН, адрес юридического лица в пределах его места нахождения, телефон или факс,</w:t>
+      </w:r>
+    </w:p>
+    <w:p>
+      <w:r>
+        <w:t>___________________________________________________________________________</w:t>
+      </w:r>
+    </w:p>
+    <w:p>
+      <w:r>
+        <w:t>полное и (или) сокращенное наименование, ОГРН, ИНН саморегулируемой организации, членом которой является указанное юридическое лицо или индивидуальный предприниматель (за исключением случаев, когда членство в саморегулируемых организациях в области строительства, реконструкции, капитального ремонта объектов капитального строительства не требуется);</w:t>
+      </w:r>
+    </w:p>
+    <w:p>
+      <w:r>
+        <w:t>___________________________________________________________________________</w:t>
+      </w:r>
+    </w:p>
+    <w:p>
+      <w:r>
+        <w:t>фамилия, имя, отчество (последнее - при наличии), паспортные данные, адрес места жительства, телефон или факс - для физических лиц, не являющихся индивидуальными предпринимателями)</w:t>
+      </w:r>
+    </w:p>
+    <w:p>
+      <w:pPr>
+        <w:keepNext/>
+      </w:pPr>
+      <w:r>
+        <w:t>Лицо, осуществляющее строительство, реконструкцию, капитальный ремонт</w:t>
+      </w:r>
+    </w:p>
+    <w:p>
+      <w:r>
+        <w:t>___________________________________________________________________________</w:t>
+      </w:r>
+    </w:p>
+    <w:p>
+      <w:r>
+        <w:rPr>
+          <w:sz w:val="18"/>
+        </w:rPr>
+        <w:t>(фамилия, имя, отчество (последнее - при наличии), адрес места жительства, ОГРНИП, ИНН индивидуального предпринимателя,</w:t>
+      </w:r>
+    </w:p>
+    <w:p>
+      <w:r>
+        <w:t>___________________________________________________________________________</w:t>
+      </w:r>
+    </w:p>
+    <w:p>
+      <w:r>
+        <w:t>полное и (или) сокращенное наименование, ОГРН, ИНН, адрес юридического лица в пределах его места нахождения, телефон или факс,</w:t>
+      </w:r>
+    </w:p>
+    <w:p>
+      <w:r>
+        <w:t>___________________________________________________________________________</w:t>
+      </w:r>
+    </w:p>
+    <w:p>
+      <w:r>
+        <w:t>полное и (или) сокращенное наименование, ОГРН, ИНН саморегулируемой организации, членом которой является указанное юридическое лицо или индивидуальный предприниматель (за исключением случаев, когда членство в саморегулируемых организациях в области строительства, реконструкции, капитального ремонта объектов капитального строительства не требуется)</w:t>
+      </w:r>
+    </w:p>
+    <w:p>
+      <w:pPr>
+        <w:keepNext/>
+      </w:pPr>
+      <w:r>
+        <w:t>Лицо, осуществляющее подготовку проектной документации</w:t>
+      </w:r>
+    </w:p>
+    <w:p>
+      <w:r>
+        <w:t>___________________________________________________________________________</w:t>
+      </w:r>
+    </w:p>
+    <w:p>
+      <w:r>
+        <w:rPr>
+          <w:sz w:val="18"/>
+        </w:rPr>
+        <w:t>(фамилия, имя, отчество (последнее - при наличии), адрес места жительства, ОГРНИП, ИНН индивидуального предпринимателя,</w:t>
+      </w:r>
+    </w:p>
+    <w:p>
+      <w:r>
+        <w:t>___________________________________________________________________________</w:t>
+      </w:r>
+    </w:p>
+    <w:p>
+      <w:r>
+        <w:t>полное и (или) сокращенное наименование, ОГРН, ИНН, адрес юридического лица в пределах его места нахождения, телефон или факс,</w:t>
+      </w:r>
+    </w:p>
+    <w:p>
+      <w:r>
+        <w:t>___________________________________________________________________________</w:t>
+      </w:r>
+    </w:p>
+    <w:p>
+      <w:r>
+        <w:t>полное и (или) сокращенное наименование, ОГРН, ИНН саморегулируемой организации, членом которой является указанное юридическое лицо или индивидуальный предприниматель (за исключением случаев, когда членство в саморегулируемых организациях в области архитектурно-строительного проектирования не требуется)</w:t>
+      </w:r>
+    </w:p>
+    <w:p>
+      <w:pPr>
+        <w:keepNext/>
+        <w:jc w:val="center"/>
+      </w:pPr>
+      <w:r>
+        <w:rPr>
+          <w:b/>
+          <w:sz w:val="24"/>
+        </w:rPr>
+        <w:t>АКТ</w:t>
+      </w:r>
+    </w:p>
+    <w:p>
+      <w:pPr>
+        <w:keepNext/>
+        <w:jc w:val="center"/>
+      </w:pPr>
+      <w:r>
+        <w:rPr>
+          <w:b/>
+          <w:sz w:val="24"/>
+        </w:rPr>
+        <w:t>освидетельствования скрытых работ</w:t>
+      </w:r>
+    </w:p>
+    <w:p>
+      <w:pPr>
+        <w:keepNext/>
+      </w:pPr>
+      <w:r>
+        <w:t>N __________ "__" _____________ 20__ г. (дата составления акта)</w:t>
+      </w:r>
+    </w:p>
+    <w:p>
+      <w:pPr>
+        <w:keepNext/>
+      </w:pPr>
+      <w:r>
+        <w:t>Представитель застройщика, технического заказчика, лица, ответственного за эксплуатацию здания, сооружения, или регионального оператора по вопросам строительного контроля</w:t>
+      </w:r>
+    </w:p>
+    <w:p>
+      <w:r>
+        <w:t>___________________________________________________________________________</w:t>
+      </w:r>
+    </w:p>
+    <w:p>
+      <w:r>
+        <w:rPr>
+          <w:sz w:val="18"/>
+        </w:rPr>
+        <w:t>(должность (при наличии), фамилия, инициалы, идентификационный номер в национальном реестре специалистов в области строительства (за исключением случаев, когда членство в саморегулируемых организациях в области строительства, реконструкции, капитального ремонта объектов капитального строительства не требуется),</w:t>
+      </w:r>
+    </w:p>
+    <w:p>
+      <w:r>
+        <w:t>___________________________________________________________________________</w:t>
+      </w:r>
+    </w:p>
+    <w:p>
+      <w:r>
+        <w:t>реквизиты распорядительного документа, подтверждающего полномочия,</w:t>
+      </w:r>
+    </w:p>
+    <w:p>
+      <w:r>
+        <w:t>___________________________________________________________________________</w:t>
+      </w:r>
+    </w:p>
+    <w:p>
+      <w:r>
+        <w:t>с указанием полного и (или) сокращенного наименования, ОГРН, ИНН, адреса юридического лица в пределах его места нахождения (в случае осуществления строительного контроля на основании договора с застройщиком или техническим заказчиком),</w:t>
+      </w:r>
+    </w:p>
+    <w:p>
+      <w:r>
+        <w:t>___________________________________________________________________________</w:t>
+      </w:r>
+    </w:p>
+    <w:p>
+      <w:r>
+        <w:t>фамилии, имени, отчества (последнее - при наличии), адреса места жительства, ОГРНИП, ИНН индивидуального предпринимателя (в случае осуществления строительного контроля на основании договора с застройщиком или техническим заказчиком)</w:t>
+      </w:r>
+    </w:p>
+    <w:p>
+      <w:pPr>
+        <w:keepNext/>
+      </w:pPr>
+      <w:r>
+        <w:t>Представитель лица, осуществляющего строительство, реконструкцию, капитальный ремонт</w:t>
+      </w:r>
+    </w:p>
+    <w:p>
+      <w:r>
+        <w:t>___________________________________________________________________________</w:t>
+      </w:r>
+    </w:p>
+    <w:p>
+      <w:r>
+        <w:rPr>
+          <w:sz w:val="18"/>
+        </w:rPr>
+        <w:t>(должность (при наличии), фамилия, инициалы, реквизиты распорядительного документа, подтверждающего полномочия)</w:t>
+      </w:r>
+    </w:p>
+    <w:p>
+      <w:pPr>
+        <w:keepNext/>
+      </w:pPr>
+      <w:r>
+        <w:t>Представитель лица, осуществляющего строительство, реконструкцию, капитальный ремонт, по вопросам строительного контроля</w:t>
+      </w:r>
+    </w:p>
+    <w:p>
+      <w:r>
+        <w:t>___________________________________________________________________________</w:t>
+      </w:r>
+    </w:p>
+    <w:p>
+      <w:r>
+        <w:rPr>
+          <w:sz w:val="18"/>
+        </w:rPr>
+        <w:t>(должность (при наличии), фамилия, инициалы, идентификационный номер в национальном реестре специалистов в области строительства (за исключением случаев, когда членство в саморегулируемых организациях в области строительства, реконструкции, капитального ремонта объектов капитального строительства не требуется),</w:t>
+      </w:r>
+    </w:p>
+    <w:p>
+      <w:r>
+        <w:t>___________________________________________________________________________</w:t>
+      </w:r>
+    </w:p>
+    <w:p>
+      <w:r>
+        <w:t>реквизиты распорядительного документа, подтверждающего полномочия)</w:t>
+      </w:r>
+    </w:p>
+    <w:p>
+      <w:pPr>
+        <w:keepNext/>
+      </w:pPr>
+      <w:r>
+        <w:t>Представитель лица, осуществляющего подготовку проектной документации (в случае привлечения застройщиком лица, осуществляющего подготовку проектной документации, для проверки соответствия выполняемых работ проектной документации согласно части 2 статьи 53 Градостроительного кодекса Российской Федерации)</w:t>
+      </w:r>
+    </w:p>
+    <w:p>
+      <w:r>
+        <w:t>___________________________________________________________________________</w:t>
+      </w:r>
+    </w:p>
+    <w:p>
+      <w:r>
+        <w:rPr>
+          <w:sz w:val="18"/>
+        </w:rPr>
+        <w:t>(должность (при наличии), фамилия, инициалы, реквизиты распорядительного документа, подтверждающего полномочия,</w:t>
+      </w:r>
+    </w:p>
+    <w:p>
+      <w:r>
+        <w:t>___________________________________________________________________________</w:t>
+      </w:r>
+    </w:p>
+    <w:p>
+      <w:r>
+        <w:t>с указанием полного и (или) сокращенного наименования, ОГРН, ИНН, адреса юридического лица в пределах его места нахождения,</w:t>
+      </w:r>
+    </w:p>
+    <w:p>
+      <w:r>
+        <w:t>___________________________________________________________________________</w:t>
+      </w:r>
+    </w:p>
+    <w:p>
+      <w:r>
+        <w:t>фамилии, имени, отчества (последнее - при наличии), адреса места жительства, ОГРНИП, ИНН индивидуального предпринимателя)</w:t>
+      </w:r>
+    </w:p>
+    <w:p>
+      <w:pPr>
+        <w:keepNext/>
+      </w:pPr>
+      <w:r>
+        <w:t>Представитель лица, выполнившего работы, подлежащие освидетельствованию (в случае выполнения работ по договорам о строительстве, реконструкции, капитальном ремонте объектов капитального строительства, заключенным с иными лицами)</w:t>
+      </w:r>
+    </w:p>
+    <w:p>
+      <w:r>
+        <w:t>___________________________________________________________________________</w:t>
+      </w:r>
+    </w:p>
+    <w:p>
+      <w:r>
+        <w:rPr>
+          <w:sz w:val="18"/>
+        </w:rPr>
+        <w:t>(должность (при наличии), фамилия, инициалы, реквизиты распорядительного документа, подтверждающего полномочия,</w:t>
+      </w:r>
+    </w:p>
+    <w:p>
+      <w:r>
+        <w:t>___________________________________________________________________________</w:t>
+      </w:r>
+    </w:p>
+    <w:p>
+      <w:r>
+        <w:t>с указанием полного и (или) сокращенного наименования, ОГРН, ИНН, адреса юридического лица в пределах его места нахождения,</w:t>
+      </w:r>
+    </w:p>
+    <w:p>
+      <w:r>
+        <w:t>___________________________________________________________________________</w:t>
+      </w:r>
+    </w:p>
+    <w:p>
+      <w:r>
+        <w:t>фамилии, имени, отчества (последнее - при наличии), адреса места жительства, ОГРНИП, ИНН индивидуального предпринимателя)</w:t>
+      </w:r>
+    </w:p>
+    <w:p>
+      <w:pPr>
+        <w:keepNext/>
+      </w:pPr>
+      <w:r>
+        <w:t>произвели осмотр работ, выполненных</w:t>
+      </w:r>
+    </w:p>
+    <w:p>
+      <w:r>
+        <w:t>__________________________________________________________________________,</w:t>
+      </w:r>
+    </w:p>
+    <w:p>
+      <w:r>
+        <w:rPr>
+          <w:sz w:val="18"/>
+        </w:rPr>
+        <w:t>(полное и (или) сокращенное наименование или фамилия, имя, отчество (последнее - при наличии) лица, выполнившего работы, подлежащие освидетельствованию)</w:t>
+      </w:r>
+    </w:p>
+    <w:p>
+      <w:pPr>
+        <w:keepNext/>
+      </w:pPr>
+      <w:r>
+        <w:t>и составили настоящий акт о нижеследующем:</w:t>
+      </w:r>
+    </w:p>
+    <w:p>
+      <w:pPr>
+        <w:keepNext/>
+      </w:pPr>
+      <w:r>
+        <w:rPr>
+          <w:b/>
+        </w:rPr>
+        <w:t>1. К освидетельствованию предъявлены следующие работы:</w:t>
+      </w:r>
+    </w:p>
+    <w:p>
+      <w:r>
+        <w:t>___________________________________________________________________________</w:t>
+      </w:r>
+    </w:p>
+    <w:p>
+      <w:r>
+        <w:rPr>
+          <w:sz w:val="18"/>
+        </w:rPr>
+        <w:t>(наименование скрытых работ)</w:t>
+      </w:r>
+    </w:p>
+    <w:p>
+      <w:pPr>
+        <w:keepNext/>
+      </w:pPr>
+      <w:r>
+        <w:rPr>
+          <w:b/>
+        </w:rPr>
+        <w:t>2. Работы выполнены по проектной документации</w:t>
+      </w:r>
+    </w:p>
+    <w:p>
+      <w:r>
+        <w:t>___________________________________________________________________________</w:t>
+      </w:r>
+    </w:p>
+    <w:p>
+      <w:r>
+        <w:rPr>
+          <w:sz w:val="18"/>
+        </w:rPr>
+        <w:t>(номер, другие реквизиты чертежа, наименование проектной и (или) рабочей</w:t>
+      </w:r>
+    </w:p>
+    <w:p>
+      <w:r>
+        <w:t>___________________________________________________________________________</w:t>
+      </w:r>
+    </w:p>
+    <w:p>
+      <w:r>
+        <w:t>документации, сведения о лицах, осуществляющих подготовку раздела проектной и (или) рабочей документации)</w:t>
+      </w:r>
+    </w:p>
+    <w:p>
+      <w:pPr>
+        <w:keepNext/>
+      </w:pPr>
+      <w:r>
+        <w:rPr>
+          <w:b/>
+        </w:rPr>
+        <w:t>3. При выполнении работ применены _________________________________________ (наименования строительных материалов</w:t>
+      </w:r>
+    </w:p>
+    <w:p>
+      <w:r>
+        <w:t>___________________________________________________________________________</w:t>
+      </w:r>
+    </w:p>
+    <w:p>
+      <w:r>
+        <w:rPr>
+          <w:sz w:val="18"/>
+        </w:rPr>
+        <w:t>(изделий), реквизиты сертификатов и (или) других документов, подтверждающих их качество и безопасность, в случае если необходимо указывать более 5 документов, указывается ссылка на их реестр, который является неотъемлемой частью акта)</w:t>
+      </w:r>
+    </w:p>
+    <w:p>
+      <w:pPr>
+        <w:keepNext/>
+      </w:pPr>
+      <w:r>
+        <w:rPr>
+          <w:b/>
+        </w:rPr>
+        <w:t>4. Предъявлены документы, подтверждающие соответствие работ предъявляемым к ним требованиям</w:t>
+      </w:r>
+    </w:p>
+    <w:p>
+      <w:r>
+        <w:t>___________________________________________________________________________</w:t>
+      </w:r>
+    </w:p>
+    <w:p>
+      <w:r>
+        <w:rPr>
+          <w:sz w:val="18"/>
+        </w:rPr>
+        <w:t>(исполнительные схемы и чертежи, результаты экспертиз, обследований,</w:t>
+      </w:r>
+    </w:p>
+    <w:p>
+      <w:r>
+        <w:t>___________________________________________________________________________</w:t>
+      </w:r>
+    </w:p>
+    <w:p>
+      <w:r>
+        <w:t>лабораторных и иных испытаний выполненных работ, проведенных в процессе строительного контроля)</w:t>
+      </w:r>
+    </w:p>
+    <w:p>
+      <w:pPr>
+        <w:keepNext/>
+      </w:pPr>
+      <w:r>
+        <w:rPr>
+          <w:b/>
+        </w:rPr>
+        <w:t>5. Даты: начала работ "__" ___________ 20__ г. окончания работ "__" ___________ 20__ г.</w:t>
+      </w:r>
+    </w:p>
+    <w:p>
+      <w:pPr>
+        <w:keepNext/>
+      </w:pPr>
+      <w:r>
+        <w:rPr>
+          <w:b/>
+        </w:rPr>
+        <w:t>6. Работы выполнены в соответствии с</w:t>
+      </w:r>
+    </w:p>
+    <w:p>
+      <w:r>
+        <w:t>___________________________________________________________________________</w:t>
+      </w:r>
+    </w:p>
+    <w:p>
+      <w:r>
+        <w:rPr>
+          <w:sz w:val="18"/>
+        </w:rPr>
+        <w:t>(наименования и структурные единицы технических регламентов,</w:t>
+      </w:r>
+    </w:p>
+    <w:p>
+      <w:r>
+        <w:t>___________________________________________________________________________</w:t>
+      </w:r>
+    </w:p>
+    <w:p>
+      <w:r>
+        <w:t>иных нормативных правовых актов, разделы проектной и (или) рабочей документации)</w:t>
+      </w:r>
+    </w:p>
+    <w:p>
+      <w:pPr>
+        <w:keepNext/>
+      </w:pPr>
+      <w:r>
+        <w:rPr>
+          <w:b/>
+        </w:rPr>
+        <w:t>7. Разрешается производство последующих работ</w:t>
+      </w:r>
+    </w:p>
+    <w:p>
+      <w:r>
+        <w:t>___________________________________________________________________________</w:t>
+      </w:r>
+    </w:p>
+    <w:p>
+      <w:r>
+        <w:rPr>
+          <w:sz w:val="18"/>
+        </w:rPr>
+        <w:t>(наименования работ, строительных конструкций, участков сетей инженерно-технического обеспечения)</w:t>
+      </w:r>
+    </w:p>
+    <w:p>
+      <w:pPr>
+        <w:keepNext/>
+      </w:pPr>
+      <w:r>
+        <w:t>Дополнительные сведения ___________________________________________________</w:t>
+      </w:r>
+    </w:p>
+    <w:p>
+      <w:pPr>
+        <w:keepNext/>
+      </w:pPr>
+      <w:r>
+        <w:t>Акт составлен в _________ экземплярах (в случае заполнения акта на бумажном носителе).</w:t>
+      </w:r>
+    </w:p>
+    <w:p>
+      <w:pPr>
+        <w:keepNext/>
+      </w:pPr>
+      <w:r>
+        <w:t>Приложения ________________________________________________________________ (исполнительные схемы и чертежи, результаты экспертиз, обследований, лабораторных и иных испытаний)</w:t>
+      </w:r>
+    </w:p>
+    <w:p>
+      <w:pPr>
+        <w:keepNext/>
+        <w:pageBreakBefore/>
+        <w:spacing w:after="140"/>
+      </w:pPr>
+      <w:r>
+        <w:t>Представитель застройщика, технического заказчика, лица, ответственного за эксплуатацию здания, сооружения, или регионального оператора по вопросам строительного контроля</w:t>
+      </w:r>
+    </w:p>
+    <w:p>
+      <w:pPr>
+        <w:keepNext/>
+        <w:spacing w:after="140"/>
+      </w:pPr>
+      <w:r>
+        <w:t>___________________________ ______________</w:t>
+      </w:r>
+    </w:p>
+    <w:p>
+      <w:pPr>
+        <w:spacing w:after="140"/>
+      </w:pPr>
+      <w:r>
+        <w:rPr>
+          <w:sz w:val="18"/>
+        </w:rPr>
+        <w:t>(фамилия, инициалы) (подпись)</w:t>
+      </w:r>
+    </w:p>
+    <w:p>
+      <w:pPr>
+        <w:keepNext/>
+        <w:spacing w:after="140"/>
+      </w:pPr>
+      <w:r>
+        <w:t>Представитель лица, осуществляющего строительство, реконструкцию, капитальный ремонт</w:t>
+      </w:r>
+    </w:p>
+    <w:p>
+      <w:pPr>
+        <w:keepNext/>
+        <w:spacing w:after="140"/>
+      </w:pPr>
+      <w:r>
+        <w:t>___________________________ ______________</w:t>
+      </w:r>
+    </w:p>
+    <w:p>
+      <w:pPr>
+        <w:spacing w:after="140"/>
+      </w:pPr>
+      <w:r>
+        <w:rPr>
+          <w:sz w:val="18"/>
+        </w:rPr>
+        <w:t>(фамилия, инициалы) (подпись)</w:t>
+      </w:r>
+    </w:p>
+    <w:p>
+      <w:pPr>
+        <w:keepNext/>
+        <w:spacing w:after="140"/>
+      </w:pPr>
+      <w:r>
+        <w:t>Представитель лица, осуществляющего строительство, реконструкцию, капитальный ремонт, по вопросам строительного контроля</w:t>
+      </w:r>
+    </w:p>
+    <w:p>
+      <w:pPr>
+        <w:keepNext/>
+        <w:spacing w:after="140"/>
+      </w:pPr>
+      <w:r>
+        <w:t>___________________________ ______________</w:t>
+      </w:r>
+    </w:p>
+    <w:p>
+      <w:pPr>
+        <w:spacing w:after="140"/>
+      </w:pPr>
+      <w:r>
+        <w:rPr>
+          <w:sz w:val="18"/>
+        </w:rPr>
+        <w:t>(фамилия, инициалы) (подпись)</w:t>
+      </w:r>
+    </w:p>
+    <w:p>
+      <w:pPr>
+        <w:keepNext/>
+        <w:spacing w:after="140"/>
+      </w:pPr>
+      <w:r>
+        <w:t>Представитель лица, осуществляющего подготовку проектной документации (в случае привлечения застройщиком лица, осуществляющего подготовку проектной документации, для проверки соответствия выполняемых работ проектной документации согласно части 2 статьи 53 Градостроительного кодекса Российской Федерации)</w:t>
+      </w:r>
+    </w:p>
+    <w:p>
+      <w:pPr>
+        <w:keepNext/>
+        <w:spacing w:after="140"/>
+      </w:pPr>
+      <w:r>
+        <w:t>___________________________ ______________</w:t>
+      </w:r>
+    </w:p>
+    <w:p>
+      <w:pPr>
+        <w:spacing w:after="140"/>
+      </w:pPr>
+      <w:r>
+        <w:rPr>
+          <w:sz w:val="18"/>
+        </w:rPr>
+        <w:t>(фамилия, инициалы) (подпись)</w:t>
+      </w:r>
+    </w:p>
+    <w:p>
+      <w:pPr>
+        <w:keepNext/>
+        <w:spacing w:after="140"/>
+      </w:pPr>
+      <w:r>
+        <w:t>Представитель лица, выполнившего работы, подлежащие освидетельствованию (в случае выполнения работ по договорам о строительстве, реконструкции, капитальном ремонте объектов капитального строительства, заключенным с иными лицами)</w:t>
+      </w:r>
+    </w:p>
+    <w:p>
+      <w:pPr>
+        <w:keepNext/>
+        <w:spacing w:after="140"/>
+      </w:pPr>
+      <w:r>
+        <w:t>___________________________ ______________</w:t>
+      </w:r>
+    </w:p>
+    <w:p>
+      <w:pPr>
+        <w:spacing w:after="140"/>
+      </w:pPr>
+      <w:r>
+        <w:rPr>
+          <w:sz w:val="18"/>
+        </w:rPr>
+        <w:t>(фамилия, инициалы) (подпись)</w:t>
+      </w:r>
+    </w:p>
+    <w:p>
+      <w:r>
+        <w:br w:type="page"/>
+      </w:r>
+    </w:p>
+    <w:p>
+      <w:pPr>
+        <w:pStyle w:val="Title"/>
+      </w:pPr>
+      <w:r>
+        <w:t>Вариант 5 Иные скрытые работы</w:t>
+      </w:r>
+    </w:p>
+    <w:p>
+      <w:r>
+        <w:rPr>
+          <w:color w:val="8E6F32"/>
+          <w:sz w:val="18"/>
+        </w:rPr>
+        <w:t>Рекомендуемый образец приложения № 3 к составу исполнительной документации, утверждённому приказом Минстроя России от 16.05.2023 № 344/пр.</w:t>
+      </w:r>
+    </w:p>
+    <w:p>
+      <w:pPr>
+        <w:spacing w:after="160"/>
+      </w:pPr>
+      <w:r>
+        <w:t>Укажите фактические работы, место и проектные решения в пунктах 1 и 2. Материалы и результаты контроля внесите в пункты 3 и 4. Подписи оформите по составу участников освидетельствования, указанному в форме.</w:t>
+      </w:r>
+    </w:p>
+    <w:p>
+      <w:r>
+        <w:t>Определите работы, которые будут скрыты следующей операцией, и точное место. Укажите проектные решения, материалы, способы проверки и разрешённые последующие работы.</w:t>
+      </w:r>
+    </w:p>
+    <w:p>
+      <w:pPr>
+        <w:keepNext/>
+      </w:pPr>
+      <w:r>
+        <w:t>Объект капитального строительства</w:t>
+      </w:r>
+    </w:p>
+    <w:p>
+      <w:r>
+        <w:t>___________________________________________________________________________</w:t>
+      </w:r>
+    </w:p>
+    <w:p>
+      <w:r>
+        <w:rPr>
+          <w:sz w:val="18"/>
+        </w:rPr>
+        <w:t>(наименование объекта капитального строительства в соответствии с проектной документацией, почтовый или строительный адрес объекта капитального строительства)</w:t>
+      </w:r>
+    </w:p>
+    <w:p>
+      <w:pPr>
+        <w:keepNext/>
+      </w:pPr>
+      <w:r>
+        <w:t>Застройщик, технический заказчик, лицо, ответственное за эксплуатацию здания, сооружения, или региональный оператор</w:t>
+      </w:r>
+    </w:p>
+    <w:p>
+      <w:r>
+        <w:t>___________________________________________________________________________</w:t>
+      </w:r>
+    </w:p>
+    <w:p>
+      <w:r>
+        <w:rPr>
+          <w:sz w:val="18"/>
+        </w:rPr>
+        <w:t>(фамилия, имя, отчество (последнее - при наличии), адрес места жительства, ОГРНИП, ИНН индивидуального предпринимателя,</w:t>
+      </w:r>
+    </w:p>
+    <w:p>
+      <w:r>
+        <w:t>___________________________________________________________________________</w:t>
+      </w:r>
+    </w:p>
+    <w:p>
+      <w:r>
+        <w:t>полное и (или) сокращенное наименование, ОГРН, ИНН, адрес юридического лица в пределах его места нахождения, телефон или факс,</w:t>
+      </w:r>
+    </w:p>
+    <w:p>
+      <w:r>
+        <w:t>___________________________________________________________________________</w:t>
+      </w:r>
+    </w:p>
+    <w:p>
+      <w:r>
+        <w:t>полное и (или) сокращенное наименование, ОГРН, ИНН саморегулируемой организации, членом которой является указанное юридическое лицо или индивидуальный предприниматель (за исключением случаев, когда членство в саморегулируемых организациях в области строительства, реконструкции, капитального ремонта объектов капитального строительства не требуется);</w:t>
+      </w:r>
+    </w:p>
+    <w:p>
+      <w:r>
+        <w:t>___________________________________________________________________________</w:t>
+      </w:r>
+    </w:p>
+    <w:p>
+      <w:r>
+        <w:t>фамилия, имя, отчество (последнее - при наличии), паспортные данные, адрес места жительства, телефон или факс - для физических лиц, не являющихся индивидуальными предпринимателями)</w:t>
+      </w:r>
+    </w:p>
+    <w:p>
+      <w:pPr>
+        <w:keepNext/>
+      </w:pPr>
+      <w:r>
+        <w:t>Лицо, осуществляющее строительство, реконструкцию, капитальный ремонт</w:t>
+      </w:r>
+    </w:p>
+    <w:p>
+      <w:r>
+        <w:t>___________________________________________________________________________</w:t>
+      </w:r>
+    </w:p>
+    <w:p>
+      <w:r>
+        <w:rPr>
+          <w:sz w:val="18"/>
+        </w:rPr>
+        <w:t>(фамилия, имя, отчество (последнее - при наличии), адрес места жительства, ОГРНИП, ИНН индивидуального предпринимателя,</w:t>
+      </w:r>
+    </w:p>
+    <w:p>
+      <w:r>
+        <w:t>___________________________________________________________________________</w:t>
+      </w:r>
+    </w:p>
+    <w:p>
+      <w:r>
+        <w:t>полное и (или) сокращенное наименование, ОГРН, ИНН, адрес юридического лица в пределах его места нахождения, телефон или факс,</w:t>
+      </w:r>
+    </w:p>
+    <w:p>
+      <w:r>
+        <w:t>___________________________________________________________________________</w:t>
+      </w:r>
+    </w:p>
+    <w:p>
+      <w:r>
+        <w:t>полное и (или) сокращенное наименование, ОГРН, ИНН саморегулируемой организации, членом которой является указанное юридическое лицо или индивидуальный предприниматель (за исключением случаев, когда членство в саморегулируемых организациях в области строительства, реконструкции, капитального ремонта объектов капитального строительства не требуется)</w:t>
+      </w:r>
+    </w:p>
+    <w:p>
+      <w:pPr>
+        <w:keepNext/>
+      </w:pPr>
+      <w:r>
+        <w:t>Лицо, осуществляющее подготовку проектной документации</w:t>
+      </w:r>
+    </w:p>
+    <w:p>
+      <w:r>
+        <w:t>___________________________________________________________________________</w:t>
+      </w:r>
+    </w:p>
+    <w:p>
+      <w:r>
+        <w:rPr>
+          <w:sz w:val="18"/>
+        </w:rPr>
+        <w:t>(фамилия, имя, отчество (последнее - при наличии), адрес места жительства, ОГРНИП, ИНН индивидуального предпринимателя,</w:t>
+      </w:r>
+    </w:p>
+    <w:p>
+      <w:r>
+        <w:t>___________________________________________________________________________</w:t>
+      </w:r>
+    </w:p>
+    <w:p>
+      <w:r>
+        <w:t>полное и (или) сокращенное наименование, ОГРН, ИНН, адрес юридического лица в пределах его места нахождения, телефон или факс,</w:t>
+      </w:r>
+    </w:p>
+    <w:p>
+      <w:r>
+        <w:t>___________________________________________________________________________</w:t>
+      </w:r>
+    </w:p>
+    <w:p>
+      <w:r>
+        <w:t>полное и (или) сокращенное наименование, ОГРН, ИНН саморегулируемой организации, членом которой является указанное юридическое лицо или индивидуальный предприниматель (за исключением случаев, когда членство в саморегулируемых организациях в области архитектурно-строительного проектирования не требуется)</w:t>
+      </w:r>
+    </w:p>
+    <w:p>
+      <w:pPr>
+        <w:keepNext/>
+        <w:jc w:val="center"/>
+      </w:pPr>
+      <w:r>
+        <w:rPr>
+          <w:b/>
+          <w:sz w:val="24"/>
+        </w:rPr>
+        <w:t>АКТ</w:t>
+      </w:r>
+    </w:p>
+    <w:p>
+      <w:pPr>
+        <w:keepNext/>
+        <w:jc w:val="center"/>
+      </w:pPr>
+      <w:r>
+        <w:rPr>
+          <w:b/>
+          <w:sz w:val="24"/>
+        </w:rPr>
+        <w:t>освидетельствования скрытых работ</w:t>
+      </w:r>
+    </w:p>
+    <w:p>
+      <w:pPr>
+        <w:keepNext/>
+      </w:pPr>
+      <w:r>
+        <w:t>N __________ "__" _____________ 20__ г. (дата составления акта)</w:t>
+      </w:r>
+    </w:p>
+    <w:p>
+      <w:pPr>
+        <w:keepNext/>
+      </w:pPr>
+      <w:r>
+        <w:t>Представитель застройщика, технического заказчика, лица, ответственного за эксплуатацию здания, сооружения, или регионального оператора по вопросам строительного контроля</w:t>
+      </w:r>
+    </w:p>
+    <w:p>
+      <w:r>
+        <w:t>___________________________________________________________________________</w:t>
+      </w:r>
+    </w:p>
+    <w:p>
+      <w:r>
+        <w:rPr>
+          <w:sz w:val="18"/>
+        </w:rPr>
+        <w:t>(должность (при наличии), фамилия, инициалы, идентификационный номер в национальном реестре специалистов в области строительства (за исключением случаев, когда членство в саморегулируемых организациях в области строительства, реконструкции, капитального ремонта объектов капитального строительства не требуется),</w:t>
+      </w:r>
+    </w:p>
+    <w:p>
+      <w:r>
+        <w:t>___________________________________________________________________________</w:t>
+      </w:r>
+    </w:p>
+    <w:p>
+      <w:r>
+        <w:t>реквизиты распорядительного документа, подтверждающего полномочия,</w:t>
+      </w:r>
+    </w:p>
+    <w:p>
+      <w:r>
+        <w:t>___________________________________________________________________________</w:t>
+      </w:r>
+    </w:p>
+    <w:p>
+      <w:r>
+        <w:t>с указанием полного и (или) сокращенного наименования, ОГРН, ИНН, адреса юридического лица в пределах его места нахождения (в случае осуществления строительного контроля на основании договора с застройщиком или техническим заказчиком),</w:t>
+      </w:r>
+    </w:p>
+    <w:p>
+      <w:r>
+        <w:t>___________________________________________________________________________</w:t>
+      </w:r>
+    </w:p>
+    <w:p>
+      <w:r>
+        <w:t>фамилии, имени, отчества (последнее - при наличии), адреса места жительства, ОГРНИП, ИНН индивидуального предпринимателя (в случае осуществления строительного контроля на основании договора с застройщиком или техническим заказчиком)</w:t>
+      </w:r>
+    </w:p>
+    <w:p>
+      <w:pPr>
+        <w:keepNext/>
+      </w:pPr>
+      <w:r>
+        <w:t>Представитель лица, осуществляющего строительство, реконструкцию, капитальный ремонт</w:t>
+      </w:r>
+    </w:p>
+    <w:p>
+      <w:r>
+        <w:t>___________________________________________________________________________</w:t>
+      </w:r>
+    </w:p>
+    <w:p>
+      <w:r>
+        <w:rPr>
+          <w:sz w:val="18"/>
+        </w:rPr>
+        <w:t>(должность (при наличии), фамилия, инициалы, реквизиты распорядительного документа, подтверждающего полномочия)</w:t>
+      </w:r>
+    </w:p>
+    <w:p>
+      <w:pPr>
+        <w:keepNext/>
+      </w:pPr>
+      <w:r>
+        <w:t>Представитель лица, осуществляющего строительство, реконструкцию, капитальный ремонт, по вопросам строительного контроля</w:t>
+      </w:r>
+    </w:p>
+    <w:p>
+      <w:r>
+        <w:t>___________________________________________________________________________</w:t>
+      </w:r>
+    </w:p>
+    <w:p>
+      <w:r>
+        <w:rPr>
+          <w:sz w:val="18"/>
+        </w:rPr>
+        <w:t>(должность (при наличии), фамилия, инициалы, идентификационный номер в национальном реестре специалистов в области строительства (за исключением случаев, когда членство в саморегулируемых организациях в области строительства, реконструкции, капитального ремонта объектов капитального строительства не требуется),</w:t>
+      </w:r>
+    </w:p>
+    <w:p>
+      <w:r>
+        <w:t>___________________________________________________________________________</w:t>
+      </w:r>
+    </w:p>
+    <w:p>
+      <w:r>
+        <w:t>реквизиты распорядительного документа, подтверждающего полномочия)</w:t>
+      </w:r>
+    </w:p>
+    <w:p>
+      <w:pPr>
+        <w:keepNext/>
+      </w:pPr>
+      <w:r>
+        <w:t>Представитель лица, осуществляющего подготовку проектной документации (в случае привлечения застройщиком лица, осуществляющего подготовку проектной документации, для проверки соответствия выполняемых работ проектной документации согласно части 2 статьи 53 Градостроительного кодекса Российской Федерации)</w:t>
+      </w:r>
+    </w:p>
+    <w:p>
+      <w:r>
+        <w:t>___________________________________________________________________________</w:t>
+      </w:r>
+    </w:p>
+    <w:p>
+      <w:r>
+        <w:rPr>
+          <w:sz w:val="18"/>
+        </w:rPr>
+        <w:t>(должность (при наличии), фамилия, инициалы, реквизиты распорядительного документа, подтверждающего полномочия,</w:t>
+      </w:r>
+    </w:p>
+    <w:p>
+      <w:r>
+        <w:t>___________________________________________________________________________</w:t>
+      </w:r>
+    </w:p>
+    <w:p>
+      <w:r>
+        <w:t>с указанием полного и (или) сокращенного наименования, ОГРН, ИНН, адреса юридического лица в пределах его места нахождения,</w:t>
+      </w:r>
+    </w:p>
+    <w:p>
+      <w:r>
+        <w:t>___________________________________________________________________________</w:t>
+      </w:r>
+    </w:p>
+    <w:p>
+      <w:r>
+        <w:t>фамилии, имени, отчества (последнее - при наличии), адреса места жительства, ОГРНИП, ИНН индивидуального предпринимателя)</w:t>
+      </w:r>
+    </w:p>
+    <w:p>
+      <w:pPr>
+        <w:keepNext/>
+      </w:pPr>
+      <w:r>
+        <w:t>Представитель лица, выполнившего работы, подлежащие освидетельствованию (в случае выполнения работ по договорам о строительстве, реконструкции, капитальном ремонте объектов капитального строительства, заключенным с иными лицами)</w:t>
+      </w:r>
+    </w:p>
+    <w:p>
+      <w:r>
+        <w:t>___________________________________________________________________________</w:t>
+      </w:r>
+    </w:p>
+    <w:p>
+      <w:r>
+        <w:rPr>
+          <w:sz w:val="18"/>
+        </w:rPr>
+        <w:t>(должность (при наличии), фамилия, инициалы, реквизиты распорядительного документа, подтверждающего полномочия,</w:t>
+      </w:r>
+    </w:p>
+    <w:p>
+      <w:r>
+        <w:t>___________________________________________________________________________</w:t>
+      </w:r>
+    </w:p>
+    <w:p>
+      <w:r>
+        <w:t>с указанием полного и (или) сокращенного наименования, ОГРН, ИНН, адреса юридического лица в пределах его места нахождения,</w:t>
+      </w:r>
+    </w:p>
+    <w:p>
+      <w:r>
+        <w:t>___________________________________________________________________________</w:t>
+      </w:r>
+    </w:p>
+    <w:p>
+      <w:r>
+        <w:t>фамилии, имени, отчества (последнее - при наличии), адреса места жительства, ОГРНИП, ИНН индивидуального предпринимателя)</w:t>
+      </w:r>
+    </w:p>
+    <w:p>
+      <w:pPr>
+        <w:keepNext/>
+      </w:pPr>
+      <w:r>
+        <w:t>произвели осмотр работ, выполненных</w:t>
+      </w:r>
+    </w:p>
+    <w:p>
+      <w:r>
+        <w:t>__________________________________________________________________________,</w:t>
+      </w:r>
+    </w:p>
+    <w:p>
+      <w:r>
+        <w:rPr>
+          <w:sz w:val="18"/>
+        </w:rPr>
+        <w:t>(полное и (или) сокращенное наименование или фамилия, имя, отчество (последнее - при наличии) лица, выполнившего работы, подлежащие освидетельствованию)</w:t>
+      </w:r>
+    </w:p>
+    <w:p>
+      <w:pPr>
+        <w:keepNext/>
+      </w:pPr>
+      <w:r>
+        <w:t>и составили настоящий акт о нижеследующем:</w:t>
+      </w:r>
+    </w:p>
+    <w:p>
+      <w:pPr>
+        <w:keepNext/>
+      </w:pPr>
+      <w:r>
+        <w:rPr>
+          <w:b/>
+        </w:rPr>
+        <w:t>1. К освидетельствованию предъявлены следующие работы:</w:t>
+      </w:r>
+    </w:p>
+    <w:p>
+      <w:r>
+        <w:t>___________________________________________________________________________</w:t>
+      </w:r>
+    </w:p>
+    <w:p>
+      <w:r>
+        <w:rPr>
+          <w:sz w:val="18"/>
+        </w:rPr>
+        <w:t>(наименование скрытых работ)</w:t>
+      </w:r>
+    </w:p>
+    <w:p>
+      <w:pPr>
+        <w:keepNext/>
+      </w:pPr>
+      <w:r>
+        <w:rPr>
+          <w:b/>
+        </w:rPr>
+        <w:t>2. Работы выполнены по проектной документации</w:t>
+      </w:r>
+    </w:p>
+    <w:p>
+      <w:r>
+        <w:t>___________________________________________________________________________</w:t>
+      </w:r>
+    </w:p>
+    <w:p>
+      <w:r>
+        <w:rPr>
+          <w:sz w:val="18"/>
+        </w:rPr>
+        <w:t>(номер, другие реквизиты чертежа, наименование проектной и (или) рабочей</w:t>
+      </w:r>
+    </w:p>
+    <w:p>
+      <w:r>
+        <w:t>___________________________________________________________________________</w:t>
+      </w:r>
+    </w:p>
+    <w:p>
+      <w:r>
+        <w:t>документации, сведения о лицах, осуществляющих подготовку раздела проектной и (или) рабочей документации)</w:t>
+      </w:r>
+    </w:p>
+    <w:p>
+      <w:pPr>
+        <w:keepNext/>
+      </w:pPr>
+      <w:r>
+        <w:rPr>
+          <w:b/>
+        </w:rPr>
+        <w:t>3. При выполнении работ применены _________________________________________ (наименования строительных материалов</w:t>
+      </w:r>
+    </w:p>
+    <w:p>
+      <w:r>
+        <w:t>___________________________________________________________________________</w:t>
+      </w:r>
+    </w:p>
+    <w:p>
+      <w:r>
+        <w:rPr>
+          <w:sz w:val="18"/>
+        </w:rPr>
+        <w:t>(изделий), реквизиты сертификатов и (или) других документов, подтверждающих их качество и безопасность, в случае если необходимо указывать более 5 документов, указывается ссылка на их реестр, который является неотъемлемой частью акта)</w:t>
+      </w:r>
+    </w:p>
+    <w:p>
+      <w:pPr>
+        <w:keepNext/>
+      </w:pPr>
+      <w:r>
+        <w:rPr>
+          <w:b/>
+        </w:rPr>
+        <w:t>4. Предъявлены документы, подтверждающие соответствие работ предъявляемым к ним требованиям</w:t>
+      </w:r>
+    </w:p>
+    <w:p>
+      <w:r>
+        <w:t>___________________________________________________________________________</w:t>
+      </w:r>
+    </w:p>
+    <w:p>
+      <w:r>
+        <w:rPr>
+          <w:sz w:val="18"/>
+        </w:rPr>
+        <w:t>(исполнительные схемы и чертежи, результаты экспертиз, обследований,</w:t>
+      </w:r>
+    </w:p>
+    <w:p>
+      <w:r>
+        <w:t>___________________________________________________________________________</w:t>
+      </w:r>
+    </w:p>
+    <w:p>
+      <w:r>
+        <w:t>лабораторных и иных испытаний выполненных работ, проведенных в процессе строительного контроля)</w:t>
+      </w:r>
+    </w:p>
+    <w:p>
+      <w:pPr>
+        <w:keepNext/>
+      </w:pPr>
+      <w:r>
+        <w:rPr>
+          <w:b/>
+        </w:rPr>
+        <w:t>5. Даты: начала работ "__" ___________ 20__ г. окончания работ "__" ___________ 20__ г.</w:t>
+      </w:r>
+    </w:p>
+    <w:p>
+      <w:pPr>
+        <w:keepNext/>
+      </w:pPr>
+      <w:r>
+        <w:rPr>
+          <w:b/>
+        </w:rPr>
+        <w:t>6. Работы выполнены в соответствии с</w:t>
+      </w:r>
+    </w:p>
+    <w:p>
+      <w:r>
+        <w:t>___________________________________________________________________________</w:t>
+      </w:r>
+    </w:p>
+    <w:p>
+      <w:r>
+        <w:rPr>
+          <w:sz w:val="18"/>
+        </w:rPr>
+        <w:t>(наименования и структурные единицы технических регламентов,</w:t>
+      </w:r>
+    </w:p>
+    <w:p>
+      <w:r>
+        <w:t>___________________________________________________________________________</w:t>
+      </w:r>
+    </w:p>
+    <w:p>
+      <w:r>
+        <w:t>иных нормативных правовых актов, разделы проектной и (или) рабочей документации)</w:t>
+      </w:r>
+    </w:p>
+    <w:p>
+      <w:pPr>
+        <w:keepNext/>
+      </w:pPr>
+      <w:r>
+        <w:rPr>
+          <w:b/>
+        </w:rPr>
+        <w:t>7. Разрешается производство последующих работ</w:t>
+      </w:r>
+    </w:p>
+    <w:p>
+      <w:r>
+        <w:t>___________________________________________________________________________</w:t>
+      </w:r>
+    </w:p>
+    <w:p>
+      <w:r>
+        <w:rPr>
+          <w:sz w:val="18"/>
+        </w:rPr>
+        <w:t>(наименования работ, строительных конструкций, участков сетей инженерно-технического обеспечения)</w:t>
+      </w:r>
+    </w:p>
+    <w:p>
+      <w:pPr>
+        <w:keepNext/>
+      </w:pPr>
+      <w:r>
+        <w:t>Дополнительные сведения ___________________________________________________</w:t>
+      </w:r>
+    </w:p>
+    <w:p>
+      <w:pPr>
+        <w:keepNext/>
+      </w:pPr>
+      <w:r>
+        <w:t>Акт составлен в _________ экземплярах (в случае заполнения акта на бумажном носителе).</w:t>
+      </w:r>
+    </w:p>
+    <w:p>
+      <w:pPr>
+        <w:keepNext/>
+      </w:pPr>
+      <w:r>
+        <w:t>Приложения ________________________________________________________________ (исполнительные схемы и чертежи, результаты экспертиз, обследований, лабораторных и иных испытаний)</w:t>
+      </w:r>
+    </w:p>
+    <w:p>
+      <w:pPr>
+        <w:keepNext/>
+        <w:pageBreakBefore/>
+        <w:spacing w:after="140"/>
+      </w:pPr>
+      <w:r>
+        <w:t>Представитель застройщика, технического заказчика, лица, ответственного за эксплуатацию здания, сооружения, или регионального оператора по вопросам строительного контроля</w:t>
+      </w:r>
+    </w:p>
+    <w:p>
+      <w:pPr>
+        <w:keepNext/>
+        <w:spacing w:after="140"/>
+      </w:pPr>
+      <w:r>
+        <w:t>___________________________ ______________</w:t>
+      </w:r>
+    </w:p>
+    <w:p>
+      <w:pPr>
+        <w:spacing w:after="140"/>
+      </w:pPr>
+      <w:r>
+        <w:rPr>
+          <w:sz w:val="18"/>
+        </w:rPr>
+        <w:t>(фамилия, инициалы) (подпись)</w:t>
+      </w:r>
+    </w:p>
+    <w:p>
+      <w:pPr>
+        <w:keepNext/>
+        <w:spacing w:after="140"/>
+      </w:pPr>
+      <w:r>
+        <w:t>Представитель лица, осуществляющего строительство, реконструкцию, капитальный ремонт</w:t>
+      </w:r>
+    </w:p>
+    <w:p>
+      <w:pPr>
+        <w:keepNext/>
+        <w:spacing w:after="140"/>
+      </w:pPr>
+      <w:r>
+        <w:t>___________________________ ______________</w:t>
+      </w:r>
+    </w:p>
+    <w:p>
+      <w:pPr>
+        <w:spacing w:after="140"/>
+      </w:pPr>
+      <w:r>
+        <w:rPr>
+          <w:sz w:val="18"/>
+        </w:rPr>
+        <w:t>(фамилия, инициалы) (подпись)</w:t>
+      </w:r>
+    </w:p>
+    <w:p>
+      <w:pPr>
+        <w:keepNext/>
+        <w:spacing w:after="140"/>
+      </w:pPr>
+      <w:r>
+        <w:t>Представитель лица, осуществляющего строительство, реконструкцию, капитальный ремонт, по вопросам строительного контроля</w:t>
+      </w:r>
+    </w:p>
+    <w:p>
+      <w:pPr>
+        <w:keepNext/>
+        <w:spacing w:after="140"/>
+      </w:pPr>
+      <w:r>
+        <w:t>___________________________ ______________</w:t>
+      </w:r>
+    </w:p>
+    <w:p>
+      <w:pPr>
+        <w:spacing w:after="140"/>
+      </w:pPr>
+      <w:r>
+        <w:rPr>
+          <w:sz w:val="18"/>
+        </w:rPr>
+        <w:t>(фамилия, инициалы) (подпись)</w:t>
+      </w:r>
+    </w:p>
+    <w:p>
+      <w:pPr>
+        <w:keepNext/>
+        <w:spacing w:after="140"/>
+      </w:pPr>
+      <w:r>
+        <w:t>Представитель лица, осуществляющего подготовку проектной документации (в случае привлечения застройщиком лица, осуществляющего подготовку проектной документации, для проверки соответствия выполняемых работ проектной документации согласно части 2 статьи 53 Градостроительного кодекса Российской Федерации)</w:t>
+      </w:r>
+    </w:p>
+    <w:p>
+      <w:pPr>
+        <w:keepNext/>
+        <w:spacing w:after="140"/>
+      </w:pPr>
+      <w:r>
+        <w:t>___________________________ ______________</w:t>
+      </w:r>
+    </w:p>
+    <w:p>
+      <w:pPr>
+        <w:spacing w:after="140"/>
+      </w:pPr>
+      <w:r>
+        <w:rPr>
+          <w:sz w:val="18"/>
+        </w:rPr>
+        <w:t>(фамилия, инициалы) (подпись)</w:t>
+      </w:r>
+    </w:p>
+    <w:p>
+      <w:pPr>
+        <w:keepNext/>
+        <w:spacing w:after="140"/>
+      </w:pPr>
+      <w:r>
+        <w:t>Представитель лица, выполнившего работы, подлежащие освидетельствованию (в случае выполнения работ по договорам о строительстве, реконструкции, капитальном ремонте объектов капитального строительства, заключенным с иными лицами)</w:t>
+      </w:r>
+    </w:p>
+    <w:p>
+      <w:pPr>
+        <w:keepNext/>
+        <w:spacing w:after="140"/>
+      </w:pPr>
+      <w:r>
+        <w:t>___________________________ ______________</w:t>
+      </w:r>
+    </w:p>
+    <w:p>
+      <w:pPr>
+        <w:spacing w:after="140"/>
+      </w:pPr>
+      <w:r>
+        <w:rPr>
+          <w:sz w:val="18"/>
+        </w:rPr>
+        <w:t>(фамилия, инициалы) (подпись)</w:t>
       </w:r>
     </w:p>
     <w:sectPr>
-      <w:pgSz w:w="12240" w:h="15840"/>
-      <w:pgMar w:top="1440" w:right="1800" w:bottom="1440" w:left="1800" w:header="720" w:footer="720" w:gutter="0"/>
+      <w:footerReference w:type="default" r:id="rId9"/>
+      <w:pgSz w:w="11906" w:h="16838"/>
+      <w:pgMar w:top="850" w:right="964" w:bottom="850" w:left="964" w:header="720" w:footer="720" w:gutter="0"/>
       <w:cols w:space="720"/>
       <w:docGrid w:linePitch="360"/>
     </w:sectPr>
   </w:body>
 </w:document>
+</file>
+
+<file path=word/footer1.xml><?xml version="1.0" encoding="utf-8"?>
+<w:ftr xmlns:m="http://schemas.openxmlformats.org/officeDocument/2006/math" xmlns:mc="http://schemas.openxmlformats.org/markup-compatibility/2006" xmlns:mo="http://schemas.microsoft.com/office/mac/office/2008/main" xmlns:mv="urn:schemas-microsoft-com:mac:vml" xmlns:o="urn:schemas-microsoft-com:office:office" xmlns:r="http://schemas.openxmlformats.org/officeDocument/2006/relationships" xmlns:v="urn:schemas-microsoft-com:vml" xmlns:w10="urn:schemas-microsoft-com:office:word" xmlns:w14="http://schemas.microsoft.com/office/word/2010/wordml" xmlns:w="http://schemas.openxmlformats.org/wordprocessingml/2006/main" xmlns:wne="http://schemas.microsoft.com/office/word/2006/wordml" xmlns:wp14="http://schemas.microsoft.com/office/word/2010/wordprocessingDrawing" xmlns:wp="http://schemas.openxmlformats.org/drawingml/2006/wordprocessingDrawing" xmlns:wpc="http://schemas.microsoft.com/office/word/2010/wordprocessingCanvas" xmlns:wpg="http://schemas.microsoft.com/office/word/2010/wordprocessingGroup" xmlns:wpi="http://schemas.microsoft.com/office/word/2010/wordprocessingInk" xmlns:wps="http://schemas.microsoft.com/office/word/2010/wordprocessingShape" mc:Ignorable="w14 wp14">
+  <w:p>
+    <w:pPr>
+      <w:pStyle w:val="Footer"/>
+      <w:jc w:val="right"/>
+    </w:pPr>
+    <w:r>
+      <w:t xml:space="preserve">Маржа в бетоне  ·  </w:t>
+    </w:r>
+    <w:fldSimple w:instr="PAGE"/>
+  </w:p>
+</w:ftr>
 </file>
 
 <file path=word/numbering.xml><?xml version="1.0" encoding="utf-8"?>
@@ -498,6 +4346,15 @@
     <w:name w:val="Normal"/>
     <w:qFormat/>
     <w:rsid w:val="00FC693F"/>
+    <w:pPr>
+      <w:widowControl/>
+      <w:spacing w:after="20"/>
+    </w:pPr>
+    <w:rPr>
+      <w:rFonts w:ascii="Times New Roman" w:hAnsi="Times New Roman"/>
+      <w:color w:val="262F37"/>
+      <w:sz w:val="20"/>
+    </w:rPr>
   </w:style>
   <w:style w:type="paragraph" w:styleId="Header">
     <w:name w:val="header"/>
@@ -558,11 +4415,11 @@
       <w:outlineLvl w:val="0"/>
     </w:pPr>
     <w:rPr>
-      <w:rFonts w:asciiTheme="majorHAnsi" w:eastAsiaTheme="majorEastAsia" w:hAnsiTheme="majorHAnsi" w:cstheme="majorBidi"/>
+      <w:rFonts w:asciiTheme="majorHAnsi" w:eastAsiaTheme="majorEastAsia" w:hAnsiTheme="majorHAnsi" w:cstheme="majorBidi" w:ascii="Times New Roman" w:hAnsi="Times New Roman"/>
       <w:b/>
       <w:bCs/>
-      <w:color w:val="365F91" w:themeColor="accent1" w:themeShade="BF"/>
-      <w:sz w:val="28"/>
+      <w:color w:val="000000"/>
+      <w:sz w:val="24"/>
       <w:szCs w:val="28"/>
     </w:rPr>
   </w:style>
@@ -840,18 +4697,17 @@
     <w:qFormat/>
     <w:rsid w:val="00FC693F"/>
     <w:pPr>
-      <w:pBdr>
-        <w:bottom w:val="single" w:sz="8" w:space="4" w:color="4F81BD" w:themeColor="accent1"/>
-      </w:pBdr>
+      <w:keepNext/>
       <w:spacing w:after="300" w:line="240" w:lineRule="auto"/>
       <w:contextualSpacing/>
     </w:pPr>
     <w:rPr>
-      <w:rFonts w:asciiTheme="majorHAnsi" w:eastAsiaTheme="majorEastAsia" w:hAnsiTheme="majorHAnsi" w:cstheme="majorBidi"/>
-      <w:color w:val="17365D" w:themeColor="text2" w:themeShade="BF"/>
+      <w:rFonts w:asciiTheme="majorHAnsi" w:eastAsiaTheme="majorEastAsia" w:hAnsiTheme="majorHAnsi" w:cstheme="majorBidi" w:ascii="Times New Roman" w:hAnsi="Times New Roman"/>
+      <w:b/>
+      <w:color w:val="000000"/>
       <w:spacing w:val="5"/>
       <w:kern w:val="28"/>
-      <w:sz w:val="52"/>
+      <w:sz w:val="34"/>
       <w:szCs w:val="52"/>
     </w:rPr>
   </w:style>
@@ -1327,9 +5183,6 @@
     <w:qFormat/>
     <w:rsid w:val="00FC693F"/>
     <w:pPr>
-      <w:pBdr>
-        <w:bottom w:val="single" w:sz="4" w:space="4" w:color="4F81BD" w:themeColor="accent1"/>
-      </w:pBdr>
       <w:spacing w:before="200" w:after="280"/>
       <w:ind w:left="936" w:right="936"/>
     </w:pPr>

</xml_diff>